<commit_message>
vault backup: 2026-09-20 07:40:49
</commit_message>
<xml_diff>
--- a/工作/圈式链式/20260918/关于“链上红盟·三联共促”党建联建近期工作推进情况的汇报（提纲）修改版-集团1-优化版.docx
+++ b/工作/圈式链式/20260918/关于“链上红盟·三联共促”党建联建近期工作推进情况的汇报（提纲）修改版-集团1-优化版.docx
@@ -31,7 +31,6 @@
           <w:rFonts w:hint="eastAsia" w:ascii="小标宋" w:hAnsi="小标宋" w:eastAsia="小标宋" w:cs="小标宋"/>
           <w:sz w:val="44"/>
           <w:szCs w:val="44"/>
-          <w:noProof/>
         </w:rPr>
         <w:t>交投智慧公司党支部“链上红盟·三联共促”工作推进情况汇报</w:t>
       </w:r>
@@ -58,6 +57,8 @@
           <w:rFonts w:hint="eastAsia"/>
         </w:rPr>
       </w:pPr>
+      <w:bookmarkStart w:id="0" w:name="_GoBack"/>
+      <w:bookmarkEnd w:id="0"/>
     </w:p>
     <w:p>
       <w:pPr>
@@ -84,7 +85,6 @@
       <w:r>
         <w:rPr>
           <w:rFonts w:hint="eastAsia"/>
-          <w:noProof/>
         </w:rPr>
         <w:t>为深入贯彻落实《关于开展市国资系统“链式+圈式”党建联建工作的实施方案》（杭国资党委发〔2026〕17号）精神，在市交投集团机关党委、资产管理公司（漕运物流集团）党委的统一领导下，交投智慧公司党支部作为杭州交投科创中心运营主体和“链上红盟·三联共促”项目重要责任单位，紧扣“组织共建、资源共享、发展共促”工作要求，坚持党建引领与园区运营深度融合，有力有序推进各项重点任务，现将近期工作推进情况汇报如下。</w:t>
       </w:r>
@@ -114,7 +114,6 @@
       <w:r>
         <w:rPr>
           <w:rFonts w:hint="eastAsia" w:ascii="楷体" w:hAnsi="楷体" w:eastAsia="楷体" w:cs="楷体"/>
-          <w:noProof/>
         </w:rPr>
         <w:t>一、强化组织领导，压紧压实职责任务</w:t>
       </w:r>
@@ -144,7 +143,6 @@
       <w:r>
         <w:rPr>
           <w:rFonts w:hint="eastAsia"/>
-          <w:noProof/>
         </w:rPr>
         <w:t>交投智慧公司党支部坚持把党建联建作为落实上级党委部署的重要政治任务，第一时间组织专题学习、研究贯彻举措，对照重点任务梳理形成任务清单，逐项明确责任人与推进节点，做到责任到岗、任务到人。在此基础上，广泛动员支部全体党员和公司全体员工共同参与、协同发力：全体党员带头认领任务、亮明身份，在链核企业需求摸排、联合招商、企业服务、活动组织等关键环节当先锋、作表率；公司全体员工立足本职岗位同步跟进，把党建联建要求融入日常运营、招商服务、设施保障等各项工作，形成“党员带头、全员参与、上下贯通”的工作格局。</w:t>
       </w:r>
@@ -174,7 +172,6 @@
       <w:r>
         <w:rPr>
           <w:rFonts w:hint="eastAsia" w:ascii="楷体" w:hAnsi="楷体" w:eastAsia="楷体" w:cs="楷体"/>
-          <w:noProof/>
         </w:rPr>
         <w:t>二、聚焦重点任务，联建工作取得阶段性成效</w:t>
       </w:r>
@@ -206,9 +203,14 @@
           <w:rFonts w:hint="eastAsia"/>
           <w:b/>
           <w:bCs/>
-          <w:noProof/>
         </w:rPr>
-        <w:t>1.强链筑基，惠企服务与园区保障同步提升。深化“1日响应、3日解难”惠企服务机制，推动企业诉求全响应、问题处置全闭环，以实现入驻企业服务覆盖率100%为目标，持续擦亮园区服务品牌。9月，按照上级党组织编制的《资源清单》《需求清单》填报模板，组织党员骨干全面摸排园区重点企业底数与产业链配套需求。目前园区共有入驻企业71家，其中国家级高新技术企业11家、专精特新企业2家、科技型中小企业7家，产业基础扎实、创新动能充足。同步全面梳理园区楼宇大厅、屋顶花园、道路、停车场等实景资源，形成总面积超2万㎡的园区实景资源清单，为场景开放和产业赋能打下坚实基础。针对B座客户雨天通行不便问题，专门设置活动防雨走廊，以“小切口”服务推动企业获得感、满意度双提升，用细节传递园区温度。</w:t>
+        <w:t>1.强链筑基，惠企服务与园区保障同步提升。</w:t>
+      </w:r>
+      <w:r>
+        <w:rPr>
+          <w:rFonts w:hint="eastAsia"/>
+        </w:rPr>
+        <w:t>深化“1日响应、3日解难”惠企服务机制，推动企业诉求全响应、问题处置全闭环，以实现入驻企业服务覆盖率100%为目标，持续擦亮园区服务品牌。9月，按照上级党组织编制的《资源清单》《需求清单》填报模板，组织党员骨干全面摸排园区重点企业底数与产业链配套需求。目前园区共有入驻企业71家，其中国家级高新技术企业11家、专精特新企业2家、科技型中小企业7家，产业基础扎实、创新动能充足。同步全面梳理园区楼宇大厅、屋顶花园、道路、停车场等实景资源，形成总面积超2万㎡的园区实景资源清单，为场景开放和产业赋能打下坚实基础。针对B座客户雨天通行不便问题，专门设置活动防雨走廊，以“小切口”服务推动企业获得感、满意度双提升，用细节传递园区温度。</w:t>
       </w:r>
     </w:p>
     <w:p>
@@ -238,9 +240,14 @@
           <w:rFonts w:hint="eastAsia"/>
           <w:b/>
           <w:bCs/>
-          <w:noProof/>
         </w:rPr>
-        <w:t>2.补链成群，产业链联合招商取得实质进展。推行“链核推荐＋党员跟进”产业链招商模式，围绕园区主导产业全面梳理杭州交投科创中心及回音必大厦轻资产项目靶向招商资源。8-9月，交投科创中心已成功招引入驻企业2家，去化面积1549.75㎡，其中交通信息技术领域企业杭州多翼创新科技有限公司（无人机方向）顺利落地园区A座6楼，产业链集聚效应初步显现，另有多个重点意向企业正在持续跟进洽谈。稳步推进回音必大厦轻资产项目运营，已完成7家企业入驻，去化面积1111㎡。坚持“以商招商、以链引链”，依托链核企业上下游资源精准推介，不断扩大产业集聚效应，为构建协同共生的产业生态蓄势赋能。</w:t>
+        <w:t>2.补链成群，产业链联合招商取得实质进展。</w:t>
+      </w:r>
+      <w:r>
+        <w:rPr>
+          <w:rFonts w:hint="eastAsia"/>
+        </w:rPr>
+        <w:t>推行“链核推荐＋党员跟进”产业链招商模式，围绕园区主导产业全面梳理杭州交投科创中心及回音必大厦轻资产项目靶向招商资源。8-9月，交投科创中心已成功招引入驻企业2家，去化面积1549.75㎡，其中交通信息技术领域企业杭州多翼创新科技有限公司（无人机方向）顺利落地园区A座6楼，产业链集聚效应初步显现，另有多个重点意向企业正在持续跟进洽谈。稳步推进回音必大厦轻资产项目运营，已完成7家企业入驻，去化面积1111㎡。坚持“以商招商、以链引链”，依托链核企业上下游资源精准推介，不断扩大产业集聚效应，为构建协同共生的产业生态蓄势赋能。</w:t>
       </w:r>
     </w:p>
     <w:p>
@@ -270,9 +277,14 @@
           <w:rFonts w:hint="eastAsia"/>
           <w:b/>
           <w:bCs/>
-          <w:noProof/>
         </w:rPr>
-        <w:t>3.场景赋能，园区智慧化应用加快落地。结合园区智慧化提升专项方案，加快落地园区一卡通、AI哨兵等智慧化应用项目，推动便捷生活、信息安防等场景数字化升级，以科技手段提升园区运营效率和企业服务体验。统筹推进综合试验环境开放筹备，目前负一楼停车场已与园内企业易达普合作建成其公司产品的展示区域，率先探索“园区即展厅、场景即试验”的转化路径，为园内企业提供产品展示、场景验证等试验支撑，推动园区实景资源加快向产业发展场景转化。</w:t>
+        <w:t>3.场景赋能，园区智慧化应用加快落地。</w:t>
+      </w:r>
+      <w:r>
+        <w:rPr>
+          <w:rFonts w:hint="eastAsia"/>
+        </w:rPr>
+        <w:t>结合园区智慧化提升专项方案，加快落地园区一卡通、AI哨兵等智慧化应用项目，推动便捷生活、信息安防等场景数字化升级，以科技手段提升园区运营效率和企业服务体验。统筹推进综合试验环境开放筹备，目前负一楼停车场已与园内企业易达普合作建成其公司产品的展示区域，率先探索“园区即展厅、场景即试验”的转化路径，为园内企业提供产品展示、场景验证等试验支撑，推动园区实景资源加快向产业发展场景转化。</w:t>
       </w:r>
     </w:p>
     <w:p>
@@ -302,9 +314,14 @@
           <w:rFonts w:hint="eastAsia"/>
           <w:b/>
           <w:bCs/>
-          <w:noProof/>
         </w:rPr>
-        <w:t>4.破圈拓界，圈层活动与产业对接有序推进。策划实施杭州交投科创中心“镜览科创，定格美好”摄影展活动，面向园区企业员工广泛征集作品，覆盖园区企业员工超百人次，以文化浸润增进企业与园区的情感黏性，营造向上向善的园区文化氛围。同时，立足10月20日开园周年重要节点，积极承接集团党建联建暨产业链对接推进会任务，初步设想以企业产品推介会为载体，组织链核企业、生态伙伴现场展示产品和技术，同步开展需求对接、资源推介、专家授课等活动，推动圈层活动与产业招引、企业服务有效贯通、互促共进。</w:t>
+        <w:t>4.破圈拓界，圈层活动与产业对接有序推进。</w:t>
+      </w:r>
+      <w:r>
+        <w:rPr>
+          <w:rFonts w:hint="eastAsia"/>
+        </w:rPr>
+        <w:t>策划实施杭州交投科创中心“镜览科创，定格美好”摄影展活动，面向园区企业员工广泛征集作品，覆盖园区企业员工超百人次，以文化浸润增进企业与园区的情感黏性，营造向上向善的园区文化氛围。同时，立足10月20日开园周年重要节点，积极承接集团党建联建暨产业链对接推进会任务，初步设想以企业产品推介会为载体，组织链核企业、生态伙伴现场展示产品和技术，同步开展需求对接、资源推介、专家授课等活动，推动圈层活动与产业招引、企业服务有效贯通、互促共进。</w:t>
       </w:r>
     </w:p>
     <w:p>
@@ -332,7 +349,6 @@
       <w:r>
         <w:rPr>
           <w:rFonts w:hint="eastAsia" w:ascii="楷体" w:hAnsi="楷体" w:eastAsia="楷体" w:cs="楷体"/>
-          <w:noProof/>
         </w:rPr>
         <w:t>三、存在的困难与建议</w:t>
       </w:r>
@@ -352,7 +368,7 @@
         <w:bidi w:val="0"/>
         <w:adjustRightInd/>
         <w:snapToGrid/>
-        <w:ind w:firstLine="643" w:firstLineChars="200"/>
+        <w:ind w:firstLine="640" w:firstLineChars="200"/>
         <w:jc w:val="both"/>
         <w:textAlignment w:val="auto"/>
         <w:rPr>
@@ -362,43 +378,8 @@
       <w:r>
         <w:rPr>
           <w:rFonts w:hint="eastAsia"/>
-          <w:b/>
-          <w:bCs/>
-          <w:noProof/>
         </w:rPr>
-        <w:t>1.专项经费未纳入年度预算。专项预算方案已拟定，但开展圈层活动、企业对接等联建工作产生的费用不在现有年度预算范围内，经费保障存在不确定性，一定程度上影响联建活动开展规模。恳请上级党委在专项经费安排上给予支持指导，统筹考虑将联建工作产生的费用不纳入年度考核指标。</w:t>
-      </w:r>
-    </w:p>
-    <w:p>
-      <w:pPr>
-        <w:keepNext w:val="0"/>
-        <w:keepLines w:val="0"/>
-        <w:pageBreakBefore w:val="0"/>
-        <w:widowControl/>
-        <w:kinsoku/>
-        <w:wordWrap/>
-        <w:overflowPunct/>
-        <w:topLinePunct w:val="0"/>
-        <w:autoSpaceDE/>
-        <w:autoSpaceDN/>
-        <w:bidi w:val="0"/>
-        <w:adjustRightInd/>
-        <w:snapToGrid/>
-        <w:ind w:firstLine="643" w:firstLineChars="200"/>
-        <w:jc w:val="both"/>
-        <w:textAlignment w:val="auto"/>
-        <w:rPr>
-          <w:rFonts w:hint="eastAsia"/>
-        </w:rPr>
-      </w:pPr>
-      <w:r>
-        <w:rPr>
-          <w:rFonts w:hint="eastAsia"/>
-          <w:b/>
-          <w:bCs/>
-          <w:noProof/>
-        </w:rPr>
-        <w:t>2.外部协调难度较大。党建联建涉及滨江物联网小镇党委、滨江行政服务中心党总支等多家外部单位，各单位隶属关系不同、工作节奏各异，智慧公司党支部层级统筹推动力度有限，跨单位资源调配与事项协调效率有待提升，需要上级党委在更高层面帮助打通联建工作中的堵点难点。</w:t>
+        <w:t>外部协调难度较大。党建联建涉及滨江物联网小镇党委、滨江行政服务中心党总支等多家外部单位，各单位隶属关系不同、工作节奏各异，智慧公司党支部层级统筹推动力度有限，跨单位资源调配与事项协调效率有待提升，需要上级党委在更高层面帮助打通联建工作中的堵点难点。</w:t>
       </w:r>
     </w:p>
     <w:p>
@@ -426,7 +407,6 @@
       <w:r>
         <w:rPr>
           <w:rFonts w:hint="eastAsia" w:ascii="楷体" w:hAnsi="楷体" w:eastAsia="楷体" w:cs="楷体"/>
-          <w:noProof/>
         </w:rPr>
         <w:t>四、下一步工作计划</w:t>
       </w:r>
@@ -456,7 +436,6 @@
       <w:r>
         <w:rPr>
           <w:rFonts w:hint="eastAsia"/>
-          <w:noProof/>
         </w:rPr>
         <w:t>9月，完成链核企业产业链需求摸排。在前期逐户走访的基础上，形成补链目标企业名单和针对性服务目录、服务流程、服务内容清单，定制链核企业专属服务包，推动服务供给与企业需求精准衔接、动态匹配。</w:t>
       </w:r>
@@ -486,7 +465,6 @@
       <w:r>
         <w:rPr>
           <w:rFonts w:hint="eastAsia"/>
-          <w:noProof/>
         </w:rPr>
         <w:t>10月，梳理完善《资源清单》《需求清单》，实现资源、需求“两张清单”动态更新、精准匹配；10月中旬以开园周年活动为契机，组织企业产品推介会，推动链核企业与生态伙伴深度对接，以活动聚人气、以圈层促发展，力争引入产业链目标企业1家。</w:t>
       </w:r>
@@ -516,7 +494,6 @@
       <w:r>
         <w:rPr>
           <w:rFonts w:hint="eastAsia"/>
-          <w:noProof/>
         </w:rPr>
         <w:t>11月，根据园区实景资源清单，推动综合试验环境面向链核企业及生态伙伴有序开放，为链核企业提供产品展示、场景应用、联合测试等试验支撑，促进“园区场景”与“企业产品”双向赋能。</w:t>
       </w:r>
@@ -546,7 +523,6 @@
       <w:r>
         <w:rPr>
           <w:rFonts w:hint="eastAsia"/>
-          <w:noProof/>
         </w:rPr>
         <w:t>12月，完成一站式惠企服务标准体系初稿编制，全面落地“1日响应、3日解难”服务机制，同步总结全年党建联建工作成效。</w:t>
       </w:r>
@@ -599,7 +575,6 @@
       <w:r>
         <w:rPr>
           <w:rFonts w:hint="eastAsia"/>
-          <w:noProof/>
         </w:rPr>
         <w:t>附件：1.园区实景资源清单</w:t>
       </w:r>
@@ -630,7 +605,6 @@
       <w:r>
         <w:rPr>
           <w:rFonts w:hint="eastAsia"/>
-          <w:noProof/>
         </w:rPr>
         <w:t>2.服务提升内容</w:t>
       </w:r>
@@ -660,7 +634,6 @@
       <w:r>
         <w:rPr>
           <w:rFonts w:hint="eastAsia"/>
-          <w:noProof/>
         </w:rPr>
         <w:t>杭州交投智慧交通产业发展有限公司党支部</w:t>
       </w:r>
@@ -687,7 +660,6 @@
       <w:r>
         <w:rPr>
           <w:rFonts w:hint="eastAsia"/>
-          <w:noProof/>
         </w:rPr>
         <w:t>2026年9月20日</w:t>
       </w:r>
@@ -704,6 +676,21 @@
     </w:p>
     <w:p>
       <w:pPr>
+        <w:rPr>
+          <w:rFonts w:hint="eastAsia"/>
+          <w:lang w:val="en-US" w:eastAsia="zh-CN"/>
+        </w:rPr>
+      </w:pPr>
+      <w:r>
+        <w:rPr>
+          <w:rFonts w:hint="eastAsia"/>
+          <w:lang w:val="en-US" w:eastAsia="zh-CN"/>
+        </w:rPr>
+        <w:br w:type="page"/>
+      </w:r>
+    </w:p>
+    <w:p>
+      <w:pPr>
         <w:ind w:left="0" w:leftChars="0" w:firstLine="0" w:firstLineChars="0"/>
         <w:jc w:val="both"/>
         <w:rPr>
@@ -714,7 +701,6 @@
       <w:r>
         <w:rPr>
           <w:rFonts w:hint="eastAsia"/>
-          <w:noProof/>
           <w:lang w:val="en-US" w:eastAsia="zh-CN"/>
         </w:rPr>
         <w:t>附件1</w:t>
@@ -722,6 +708,7 @@
     </w:p>
     <w:tbl>
       <w:tblPr>
+        <w:tblStyle w:val="28"/>
         <w:tblW w:w="5000" w:type="pct"/>
         <w:tblInd w:w="0" w:type="dxa"/>
         <w:tblBorders>
@@ -732,7 +719,7 @@
           <w:insideH w:val="none" w:color="auto" w:sz="0" w:space="0"/>
           <w:insideV w:val="none" w:color="auto" w:sz="0" w:space="0"/>
         </w:tblBorders>
-        <w:shd w:val="clear"/>
+        <w:shd w:val="clear" w:color="auto" w:fill="auto"/>
         <w:tblLayout w:type="autofit"/>
         <w:tblCellMar>
           <w:top w:w="0" w:type="dxa"/>
@@ -756,7 +743,7 @@
             <w:insideH w:val="none" w:color="auto" w:sz="0" w:space="0"/>
             <w:insideV w:val="none" w:color="auto" w:sz="0" w:space="0"/>
           </w:tblBorders>
-          <w:shd w:val="clear"/>
+          <w:shd w:val="clear" w:color="auto" w:fill="auto"/>
           <w:tblCellMar>
             <w:top w:w="0" w:type="dxa"/>
             <w:left w:w="108" w:type="dxa"/>
@@ -777,7 +764,7 @@
               <w:bottom w:val="nil"/>
               <w:right w:val="nil"/>
             </w:tcBorders>
-            <w:shd w:val="clear"/>
+            <w:shd w:val="clear" w:color="auto" w:fill="auto"/>
             <w:noWrap/>
             <w:vAlign w:val="center"/>
           </w:tcPr>
@@ -813,8 +800,6 @@
                 <w:sz w:val="32"/>
                 <w:szCs w:val="32"/>
                 <w:u w:val="none"/>
-                <w:bdr w:val="none" w:color="auto" w:sz="0" w:space="0"/>
-                <w:noProof/>
                 <w:lang w:val="en-US" w:eastAsia="zh-CN" w:bidi="ar"/>
               </w:rPr>
               <w:t>杭州交投科创中心场所使用场景清单</w:t>
@@ -851,7 +836,7 @@
               <w:bottom w:val="single" w:color="000000" w:sz="4" w:space="0"/>
               <w:right w:val="single" w:color="000000" w:sz="4" w:space="0"/>
             </w:tcBorders>
-            <w:shd w:val="clear"/>
+            <w:shd w:val="clear" w:color="auto" w:fill="auto"/>
             <w:noWrap/>
             <w:vAlign w:val="center"/>
           </w:tcPr>
@@ -888,7 +873,6 @@
                 <w:sz w:val="24"/>
                 <w:szCs w:val="24"/>
                 <w:u w:val="none"/>
-                <w:bdr w:val="none" w:color="auto" w:sz="0" w:space="0"/>
                 <w:lang w:val="en-US" w:eastAsia="zh-CN" w:bidi="ar"/>
               </w:rPr>
               <w:t>序号</w:t>
@@ -904,7 +888,7 @@
               <w:bottom w:val="single" w:color="000000" w:sz="4" w:space="0"/>
               <w:right w:val="single" w:color="000000" w:sz="4" w:space="0"/>
             </w:tcBorders>
-            <w:shd w:val="clear"/>
+            <w:shd w:val="clear" w:color="auto" w:fill="auto"/>
             <w:noWrap/>
             <w:vAlign w:val="center"/>
           </w:tcPr>
@@ -941,7 +925,6 @@
                 <w:sz w:val="24"/>
                 <w:szCs w:val="24"/>
                 <w:u w:val="none"/>
-                <w:bdr w:val="none" w:color="auto" w:sz="0" w:space="0"/>
                 <w:lang w:val="en-US" w:eastAsia="zh-CN" w:bidi="ar"/>
               </w:rPr>
               <w:t>场所名称</w:t>
@@ -957,7 +940,7 @@
               <w:bottom w:val="single" w:color="000000" w:sz="4" w:space="0"/>
               <w:right w:val="single" w:color="000000" w:sz="4" w:space="0"/>
             </w:tcBorders>
-            <w:shd w:val="clear"/>
+            <w:shd w:val="clear" w:color="auto" w:fill="auto"/>
             <w:noWrap/>
             <w:vAlign w:val="center"/>
           </w:tcPr>
@@ -994,7 +977,6 @@
                 <w:sz w:val="24"/>
                 <w:szCs w:val="24"/>
                 <w:u w:val="none"/>
-                <w:bdr w:val="none" w:color="auto" w:sz="0" w:space="0"/>
                 <w:lang w:val="en-US" w:eastAsia="zh-CN" w:bidi="ar"/>
               </w:rPr>
               <w:t>面积（㎡）</w:t>
@@ -1012,6 +994,7 @@
             <w:insideH w:val="none" w:color="auto" w:sz="0" w:space="0"/>
             <w:insideV w:val="none" w:color="auto" w:sz="0" w:space="0"/>
           </w:tblBorders>
+          <w:shd w:val="clear" w:color="auto" w:fill="auto"/>
           <w:tblCellMar>
             <w:top w:w="0" w:type="dxa"/>
             <w:left w:w="108" w:type="dxa"/>
@@ -1031,7 +1014,7 @@
               <w:bottom w:val="single" w:color="000000" w:sz="4" w:space="0"/>
               <w:right w:val="single" w:color="000000" w:sz="4" w:space="0"/>
             </w:tcBorders>
-            <w:shd w:val="clear"/>
+            <w:shd w:val="clear" w:color="auto" w:fill="auto"/>
             <w:noWrap/>
             <w:vAlign w:val="center"/>
           </w:tcPr>
@@ -1064,7 +1047,6 @@
                 <w:sz w:val="24"/>
                 <w:szCs w:val="24"/>
                 <w:u w:val="none"/>
-                <w:bdr w:val="none" w:color="auto" w:sz="0" w:space="0"/>
                 <w:lang w:val="en-US" w:eastAsia="zh-CN" w:bidi="ar"/>
               </w:rPr>
               <w:t>1</w:t>
@@ -1080,7 +1062,7 @@
               <w:bottom w:val="single" w:color="000000" w:sz="4" w:space="0"/>
               <w:right w:val="single" w:color="000000" w:sz="4" w:space="0"/>
             </w:tcBorders>
-            <w:shd w:val="clear"/>
+            <w:shd w:val="clear" w:color="auto" w:fill="auto"/>
             <w:noWrap/>
             <w:vAlign w:val="center"/>
           </w:tcPr>
@@ -1113,7 +1095,6 @@
                 <w:sz w:val="24"/>
                 <w:szCs w:val="24"/>
                 <w:u w:val="none"/>
-                <w:bdr w:val="none" w:color="auto" w:sz="0" w:space="0"/>
                 <w:lang w:val="en-US" w:eastAsia="zh-CN" w:bidi="ar"/>
               </w:rPr>
               <w:t>A座大厅空间</w:t>
@@ -1129,7 +1110,7 @@
               <w:bottom w:val="single" w:color="000000" w:sz="4" w:space="0"/>
               <w:right w:val="single" w:color="000000" w:sz="4" w:space="0"/>
             </w:tcBorders>
-            <w:shd w:val="clear"/>
+            <w:shd w:val="clear" w:color="auto" w:fill="auto"/>
             <w:noWrap/>
             <w:vAlign w:val="center"/>
           </w:tcPr>
@@ -1162,7 +1143,6 @@
                 <w:sz w:val="24"/>
                 <w:szCs w:val="24"/>
                 <w:u w:val="none"/>
-                <w:bdr w:val="none" w:color="auto" w:sz="0" w:space="0"/>
                 <w:lang w:val="en-US" w:eastAsia="zh-CN" w:bidi="ar"/>
               </w:rPr>
               <w:t>700</w:t>
@@ -1180,6 +1160,7 @@
             <w:insideH w:val="none" w:color="auto" w:sz="0" w:space="0"/>
             <w:insideV w:val="none" w:color="auto" w:sz="0" w:space="0"/>
           </w:tblBorders>
+          <w:shd w:val="clear" w:color="auto" w:fill="auto"/>
           <w:tblCellMar>
             <w:top w:w="0" w:type="dxa"/>
             <w:left w:w="108" w:type="dxa"/>
@@ -1199,7 +1180,7 @@
               <w:bottom w:val="single" w:color="000000" w:sz="4" w:space="0"/>
               <w:right w:val="single" w:color="000000" w:sz="4" w:space="0"/>
             </w:tcBorders>
-            <w:shd w:val="clear"/>
+            <w:shd w:val="clear" w:color="auto" w:fill="auto"/>
             <w:noWrap/>
             <w:vAlign w:val="center"/>
           </w:tcPr>
@@ -1232,7 +1213,6 @@
                 <w:sz w:val="24"/>
                 <w:szCs w:val="24"/>
                 <w:u w:val="none"/>
-                <w:bdr w:val="none" w:color="auto" w:sz="0" w:space="0"/>
                 <w:lang w:val="en-US" w:eastAsia="zh-CN" w:bidi="ar"/>
               </w:rPr>
               <w:t>2</w:t>
@@ -1248,7 +1228,7 @@
               <w:bottom w:val="single" w:color="000000" w:sz="4" w:space="0"/>
               <w:right w:val="single" w:color="000000" w:sz="4" w:space="0"/>
             </w:tcBorders>
-            <w:shd w:val="clear"/>
+            <w:shd w:val="clear" w:color="auto" w:fill="auto"/>
             <w:noWrap/>
             <w:vAlign w:val="center"/>
           </w:tcPr>
@@ -1281,7 +1261,6 @@
                 <w:sz w:val="24"/>
                 <w:szCs w:val="24"/>
                 <w:u w:val="none"/>
-                <w:bdr w:val="none" w:color="auto" w:sz="0" w:space="0"/>
                 <w:lang w:val="en-US" w:eastAsia="zh-CN" w:bidi="ar"/>
               </w:rPr>
               <w:t>B座大厅空间</w:t>
@@ -1297,7 +1276,7 @@
               <w:bottom w:val="single" w:color="000000" w:sz="4" w:space="0"/>
               <w:right w:val="single" w:color="000000" w:sz="4" w:space="0"/>
             </w:tcBorders>
-            <w:shd w:val="clear"/>
+            <w:shd w:val="clear" w:color="auto" w:fill="auto"/>
             <w:noWrap/>
             <w:vAlign w:val="center"/>
           </w:tcPr>
@@ -1330,7 +1309,6 @@
                 <w:sz w:val="24"/>
                 <w:szCs w:val="24"/>
                 <w:u w:val="none"/>
-                <w:bdr w:val="none" w:color="auto" w:sz="0" w:space="0"/>
                 <w:lang w:val="en-US" w:eastAsia="zh-CN" w:bidi="ar"/>
               </w:rPr>
               <w:t>200</w:t>
@@ -1367,7 +1345,7 @@
               <w:bottom w:val="single" w:color="000000" w:sz="4" w:space="0"/>
               <w:right w:val="single" w:color="000000" w:sz="4" w:space="0"/>
             </w:tcBorders>
-            <w:shd w:val="clear"/>
+            <w:shd w:val="clear" w:color="auto" w:fill="auto"/>
             <w:noWrap/>
             <w:vAlign w:val="center"/>
           </w:tcPr>
@@ -1400,7 +1378,6 @@
                 <w:sz w:val="24"/>
                 <w:szCs w:val="24"/>
                 <w:u w:val="none"/>
-                <w:bdr w:val="none" w:color="auto" w:sz="0" w:space="0"/>
                 <w:lang w:val="en-US" w:eastAsia="zh-CN" w:bidi="ar"/>
               </w:rPr>
               <w:t>3</w:t>
@@ -1416,7 +1393,7 @@
               <w:bottom w:val="single" w:color="000000" w:sz="4" w:space="0"/>
               <w:right w:val="single" w:color="000000" w:sz="4" w:space="0"/>
             </w:tcBorders>
-            <w:shd w:val="clear"/>
+            <w:shd w:val="clear" w:color="auto" w:fill="auto"/>
             <w:noWrap/>
             <w:vAlign w:val="center"/>
           </w:tcPr>
@@ -1449,7 +1426,6 @@
                 <w:sz w:val="24"/>
                 <w:szCs w:val="24"/>
                 <w:u w:val="none"/>
-                <w:bdr w:val="none" w:color="auto" w:sz="0" w:space="0"/>
                 <w:lang w:val="en-US" w:eastAsia="zh-CN" w:bidi="ar"/>
               </w:rPr>
               <w:t>C座大厅空间</w:t>
@@ -1465,7 +1441,7 @@
               <w:bottom w:val="single" w:color="000000" w:sz="4" w:space="0"/>
               <w:right w:val="single" w:color="000000" w:sz="4" w:space="0"/>
             </w:tcBorders>
-            <w:shd w:val="clear"/>
+            <w:shd w:val="clear" w:color="auto" w:fill="auto"/>
             <w:noWrap/>
             <w:vAlign w:val="center"/>
           </w:tcPr>
@@ -1498,10 +1474,175 @@
                 <w:sz w:val="24"/>
                 <w:szCs w:val="24"/>
                 <w:u w:val="none"/>
-                <w:bdr w:val="none" w:color="auto" w:sz="0" w:space="0"/>
                 <w:lang w:val="en-US" w:eastAsia="zh-CN" w:bidi="ar"/>
               </w:rPr>
               <w:t>150</w:t>
+            </w:r>
+          </w:p>
+        </w:tc>
+      </w:tr>
+      <w:tr>
+        <w:tblPrEx>
+          <w:tblBorders>
+            <w:top w:val="none" w:color="auto" w:sz="0" w:space="0"/>
+            <w:left w:val="none" w:color="auto" w:sz="0" w:space="0"/>
+            <w:bottom w:val="none" w:color="auto" w:sz="0" w:space="0"/>
+            <w:right w:val="none" w:color="auto" w:sz="0" w:space="0"/>
+            <w:insideH w:val="none" w:color="auto" w:sz="0" w:space="0"/>
+            <w:insideV w:val="none" w:color="auto" w:sz="0" w:space="0"/>
+          </w:tblBorders>
+          <w:shd w:val="clear" w:color="auto" w:fill="auto"/>
+          <w:tblCellMar>
+            <w:top w:w="0" w:type="dxa"/>
+            <w:left w:w="108" w:type="dxa"/>
+            <w:bottom w:w="0" w:type="dxa"/>
+            <w:right w:w="108" w:type="dxa"/>
+          </w:tblCellMar>
+        </w:tblPrEx>
+        <w:trPr>
+          <w:trHeight w:val="699" w:hRule="atLeast"/>
+        </w:trPr>
+        <w:tc>
+          <w:tcPr>
+            <w:tcW w:w="1174" w:type="pct"/>
+            <w:tcBorders>
+              <w:top w:val="single" w:color="000000" w:sz="4" w:space="0"/>
+              <w:left w:val="single" w:color="000000" w:sz="4" w:space="0"/>
+              <w:bottom w:val="single" w:color="000000" w:sz="4" w:space="0"/>
+              <w:right w:val="single" w:color="000000" w:sz="4" w:space="0"/>
+            </w:tcBorders>
+            <w:shd w:val="clear" w:color="auto" w:fill="auto"/>
+            <w:noWrap/>
+            <w:vAlign w:val="center"/>
+          </w:tcPr>
+          <w:p>
+            <w:pPr>
+              <w:keepNext w:val="0"/>
+              <w:keepLines w:val="0"/>
+              <w:widowControl/>
+              <w:suppressLineNumbers w:val="0"/>
+              <w:ind w:left="0" w:leftChars="0" w:firstLine="0" w:firstLineChars="0"/>
+              <w:jc w:val="center"/>
+              <w:textAlignment w:val="center"/>
+              <w:rPr>
+                <w:rFonts w:hint="eastAsia" w:ascii="宋体" w:hAnsi="宋体" w:eastAsia="宋体" w:cs="宋体"/>
+                <w:i w:val="0"/>
+                <w:iCs w:val="0"/>
+                <w:color w:val="000000"/>
+                <w:sz w:val="24"/>
+                <w:szCs w:val="24"/>
+                <w:u w:val="none"/>
+              </w:rPr>
+            </w:pPr>
+            <w:r>
+              <w:rPr>
+                <w:rFonts w:hint="eastAsia" w:ascii="宋体" w:hAnsi="宋体" w:eastAsia="宋体" w:cs="宋体"/>
+                <w:i w:val="0"/>
+                <w:iCs w:val="0"/>
+                <w:color w:val="000000"/>
+                <w:kern w:val="0"/>
+                <w:sz w:val="24"/>
+                <w:szCs w:val="24"/>
+                <w:u w:val="none"/>
+                <w:lang w:val="en-US" w:eastAsia="zh-CN" w:bidi="ar"/>
+              </w:rPr>
+              <w:t>4</w:t>
+            </w:r>
+          </w:p>
+        </w:tc>
+        <w:tc>
+          <w:tcPr>
+            <w:tcW w:w="2015" w:type="pct"/>
+            <w:tcBorders>
+              <w:top w:val="single" w:color="000000" w:sz="4" w:space="0"/>
+              <w:left w:val="single" w:color="000000" w:sz="4" w:space="0"/>
+              <w:bottom w:val="single" w:color="000000" w:sz="4" w:space="0"/>
+              <w:right w:val="single" w:color="000000" w:sz="4" w:space="0"/>
+            </w:tcBorders>
+            <w:shd w:val="clear" w:color="auto" w:fill="auto"/>
+            <w:noWrap/>
+            <w:vAlign w:val="center"/>
+          </w:tcPr>
+          <w:p>
+            <w:pPr>
+              <w:keepNext w:val="0"/>
+              <w:keepLines w:val="0"/>
+              <w:widowControl/>
+              <w:suppressLineNumbers w:val="0"/>
+              <w:ind w:left="0" w:leftChars="0" w:firstLine="0" w:firstLineChars="0"/>
+              <w:jc w:val="center"/>
+              <w:textAlignment w:val="center"/>
+              <w:rPr>
+                <w:rFonts w:hint="eastAsia" w:ascii="宋体" w:hAnsi="宋体" w:eastAsia="宋体" w:cs="宋体"/>
+                <w:i w:val="0"/>
+                <w:iCs w:val="0"/>
+                <w:color w:val="000000"/>
+                <w:sz w:val="24"/>
+                <w:szCs w:val="24"/>
+                <w:u w:val="none"/>
+              </w:rPr>
+            </w:pPr>
+            <w:r>
+              <w:rPr>
+                <w:rFonts w:hint="eastAsia" w:ascii="宋体" w:hAnsi="宋体" w:eastAsia="宋体" w:cs="宋体"/>
+                <w:i w:val="0"/>
+                <w:iCs w:val="0"/>
+                <w:color w:val="000000"/>
+                <w:kern w:val="0"/>
+                <w:sz w:val="24"/>
+                <w:szCs w:val="24"/>
+                <w:u w:val="none"/>
+                <w:lang w:val="en-US" w:eastAsia="zh-CN" w:bidi="ar"/>
+              </w:rPr>
+              <w:t>裙房屋顶花园</w:t>
+            </w:r>
+          </w:p>
+        </w:tc>
+        <w:tc>
+          <w:tcPr>
+            <w:tcW w:w="1809" w:type="pct"/>
+            <w:tcBorders>
+              <w:top w:val="single" w:color="000000" w:sz="4" w:space="0"/>
+              <w:left w:val="single" w:color="000000" w:sz="4" w:space="0"/>
+              <w:bottom w:val="single" w:color="000000" w:sz="4" w:space="0"/>
+              <w:right w:val="single" w:color="000000" w:sz="4" w:space="0"/>
+            </w:tcBorders>
+            <w:shd w:val="clear" w:color="auto" w:fill="auto"/>
+            <w:noWrap/>
+            <w:vAlign w:val="center"/>
+          </w:tcPr>
+          <w:p>
+            <w:pPr>
+              <w:keepNext w:val="0"/>
+              <w:keepLines w:val="0"/>
+              <w:widowControl/>
+              <w:suppressLineNumbers w:val="0"/>
+              <w:ind w:left="0" w:leftChars="0" w:firstLine="0" w:firstLineChars="0"/>
+              <w:jc w:val="center"/>
+              <w:textAlignment w:val="center"/>
+              <w:rPr>
+                <w:rFonts w:hint="eastAsia" w:ascii="宋体" w:hAnsi="宋体" w:eastAsia="宋体" w:cs="宋体"/>
+                <w:i w:val="0"/>
+                <w:iCs w:val="0"/>
+                <w:color w:val="000000"/>
+                <w:sz w:val="24"/>
+                <w:szCs w:val="24"/>
+                <w:u w:val="none"/>
+              </w:rPr>
+            </w:pPr>
+            <w:r>
+              <w:rPr>
+                <w:rFonts w:hint="eastAsia" w:ascii="宋体" w:hAnsi="宋体" w:eastAsia="宋体" w:cs="宋体"/>
+                <w:i w:val="0"/>
+                <w:iCs w:val="0"/>
+                <w:color w:val="000000"/>
+                <w:kern w:val="0"/>
+                <w:sz w:val="24"/>
+                <w:szCs w:val="24"/>
+                <w:u w:val="none"/>
+                <w:lang w:val="en-US" w:eastAsia="zh-CN" w:bidi="ar"/>
+              </w:rPr>
+              <w:t>1700</w:t>
             </w:r>
           </w:p>
         </w:tc>
@@ -1535,7 +1676,7 @@
               <w:bottom w:val="single" w:color="000000" w:sz="4" w:space="0"/>
               <w:right w:val="single" w:color="000000" w:sz="4" w:space="0"/>
             </w:tcBorders>
-            <w:shd w:val="clear"/>
+            <w:shd w:val="clear" w:color="auto" w:fill="auto"/>
             <w:noWrap/>
             <w:vAlign w:val="center"/>
           </w:tcPr>
@@ -1568,10 +1709,9 @@
                 <w:sz w:val="24"/>
                 <w:szCs w:val="24"/>
                 <w:u w:val="none"/>
-                <w:bdr w:val="none" w:color="auto" w:sz="0" w:space="0"/>
                 <w:lang w:val="en-US" w:eastAsia="zh-CN" w:bidi="ar"/>
               </w:rPr>
-              <w:t>4</w:t>
+              <w:t>5</w:t>
             </w:r>
           </w:p>
         </w:tc>
@@ -1584,7 +1724,7 @@
               <w:bottom w:val="single" w:color="000000" w:sz="4" w:space="0"/>
               <w:right w:val="single" w:color="000000" w:sz="4" w:space="0"/>
             </w:tcBorders>
-            <w:shd w:val="clear"/>
+            <w:shd w:val="clear" w:color="auto" w:fill="auto"/>
             <w:noWrap/>
             <w:vAlign w:val="center"/>
           </w:tcPr>
@@ -1617,10 +1757,9 @@
                 <w:sz w:val="24"/>
                 <w:szCs w:val="24"/>
                 <w:u w:val="none"/>
-                <w:bdr w:val="none" w:color="auto" w:sz="0" w:space="0"/>
                 <w:lang w:val="en-US" w:eastAsia="zh-CN" w:bidi="ar"/>
               </w:rPr>
-              <w:t>裙房屋顶花园</w:t>
+              <w:t>地面中心花园</w:t>
             </w:r>
           </w:p>
         </w:tc>
@@ -1633,7 +1772,7 @@
               <w:bottom w:val="single" w:color="000000" w:sz="4" w:space="0"/>
               <w:right w:val="single" w:color="000000" w:sz="4" w:space="0"/>
             </w:tcBorders>
-            <w:shd w:val="clear"/>
+            <w:shd w:val="clear" w:color="auto" w:fill="auto"/>
             <w:noWrap/>
             <w:vAlign w:val="center"/>
           </w:tcPr>
@@ -1666,10 +1805,9 @@
                 <w:sz w:val="24"/>
                 <w:szCs w:val="24"/>
                 <w:u w:val="none"/>
-                <w:bdr w:val="none" w:color="auto" w:sz="0" w:space="0"/>
                 <w:lang w:val="en-US" w:eastAsia="zh-CN" w:bidi="ar"/>
               </w:rPr>
-              <w:t>1700</w:t>
+              <w:t>1100</w:t>
             </w:r>
           </w:p>
         </w:tc>
@@ -1684,7 +1822,7 @@
             <w:insideH w:val="none" w:color="auto" w:sz="0" w:space="0"/>
             <w:insideV w:val="none" w:color="auto" w:sz="0" w:space="0"/>
           </w:tblBorders>
-          <w:shd w:val="clear"/>
+          <w:shd w:val="clear" w:color="auto" w:fill="auto"/>
           <w:tblCellMar>
             <w:top w:w="0" w:type="dxa"/>
             <w:left w:w="108" w:type="dxa"/>
@@ -1704,7 +1842,7 @@
               <w:bottom w:val="single" w:color="000000" w:sz="4" w:space="0"/>
               <w:right w:val="single" w:color="000000" w:sz="4" w:space="0"/>
             </w:tcBorders>
-            <w:shd w:val="clear"/>
+            <w:shd w:val="clear" w:color="auto" w:fill="auto"/>
             <w:noWrap/>
             <w:vAlign w:val="center"/>
           </w:tcPr>
@@ -1737,10 +1875,9 @@
                 <w:sz w:val="24"/>
                 <w:szCs w:val="24"/>
                 <w:u w:val="none"/>
-                <w:bdr w:val="none" w:color="auto" w:sz="0" w:space="0"/>
                 <w:lang w:val="en-US" w:eastAsia="zh-CN" w:bidi="ar"/>
               </w:rPr>
-              <w:t>5</w:t>
+              <w:t>6</w:t>
             </w:r>
           </w:p>
         </w:tc>
@@ -1753,7 +1890,7 @@
               <w:bottom w:val="single" w:color="000000" w:sz="4" w:space="0"/>
               <w:right w:val="single" w:color="000000" w:sz="4" w:space="0"/>
             </w:tcBorders>
-            <w:shd w:val="clear"/>
+            <w:shd w:val="clear" w:color="auto" w:fill="auto"/>
             <w:noWrap/>
             <w:vAlign w:val="center"/>
           </w:tcPr>
@@ -1786,10 +1923,9 @@
                 <w:sz w:val="24"/>
                 <w:szCs w:val="24"/>
                 <w:u w:val="none"/>
-                <w:bdr w:val="none" w:color="auto" w:sz="0" w:space="0"/>
                 <w:lang w:val="en-US" w:eastAsia="zh-CN" w:bidi="ar"/>
               </w:rPr>
-              <w:t>地面中心花园</w:t>
+              <w:t>B座屋顶</w:t>
             </w:r>
           </w:p>
         </w:tc>
@@ -1802,7 +1938,7 @@
               <w:bottom w:val="single" w:color="000000" w:sz="4" w:space="0"/>
               <w:right w:val="single" w:color="000000" w:sz="4" w:space="0"/>
             </w:tcBorders>
-            <w:shd w:val="clear"/>
+            <w:shd w:val="clear" w:color="auto" w:fill="auto"/>
             <w:noWrap/>
             <w:vAlign w:val="center"/>
           </w:tcPr>
@@ -1835,10 +1971,175 @@
                 <w:sz w:val="24"/>
                 <w:szCs w:val="24"/>
                 <w:u w:val="none"/>
-                <w:bdr w:val="none" w:color="auto" w:sz="0" w:space="0"/>
                 <w:lang w:val="en-US" w:eastAsia="zh-CN" w:bidi="ar"/>
               </w:rPr>
-              <w:t>1100</w:t>
+              <w:t>800</w:t>
+            </w:r>
+          </w:p>
+        </w:tc>
+      </w:tr>
+      <w:tr>
+        <w:tblPrEx>
+          <w:tblBorders>
+            <w:top w:val="none" w:color="auto" w:sz="0" w:space="0"/>
+            <w:left w:val="none" w:color="auto" w:sz="0" w:space="0"/>
+            <w:bottom w:val="none" w:color="auto" w:sz="0" w:space="0"/>
+            <w:right w:val="none" w:color="auto" w:sz="0" w:space="0"/>
+            <w:insideH w:val="none" w:color="auto" w:sz="0" w:space="0"/>
+            <w:insideV w:val="none" w:color="auto" w:sz="0" w:space="0"/>
+          </w:tblBorders>
+          <w:shd w:val="clear" w:color="auto" w:fill="auto"/>
+          <w:tblCellMar>
+            <w:top w:w="0" w:type="dxa"/>
+            <w:left w:w="108" w:type="dxa"/>
+            <w:bottom w:w="0" w:type="dxa"/>
+            <w:right w:w="108" w:type="dxa"/>
+          </w:tblCellMar>
+        </w:tblPrEx>
+        <w:trPr>
+          <w:trHeight w:val="699" w:hRule="atLeast"/>
+        </w:trPr>
+        <w:tc>
+          <w:tcPr>
+            <w:tcW w:w="1174" w:type="pct"/>
+            <w:tcBorders>
+              <w:top w:val="single" w:color="000000" w:sz="4" w:space="0"/>
+              <w:left w:val="single" w:color="000000" w:sz="4" w:space="0"/>
+              <w:bottom w:val="single" w:color="000000" w:sz="4" w:space="0"/>
+              <w:right w:val="single" w:color="000000" w:sz="4" w:space="0"/>
+            </w:tcBorders>
+            <w:shd w:val="clear" w:color="auto" w:fill="auto"/>
+            <w:noWrap/>
+            <w:vAlign w:val="center"/>
+          </w:tcPr>
+          <w:p>
+            <w:pPr>
+              <w:keepNext w:val="0"/>
+              <w:keepLines w:val="0"/>
+              <w:widowControl/>
+              <w:suppressLineNumbers w:val="0"/>
+              <w:ind w:left="0" w:leftChars="0" w:firstLine="0" w:firstLineChars="0"/>
+              <w:jc w:val="center"/>
+              <w:textAlignment w:val="center"/>
+              <w:rPr>
+                <w:rFonts w:hint="eastAsia" w:ascii="宋体" w:hAnsi="宋体" w:eastAsia="宋体" w:cs="宋体"/>
+                <w:i w:val="0"/>
+                <w:iCs w:val="0"/>
+                <w:color w:val="000000"/>
+                <w:sz w:val="24"/>
+                <w:szCs w:val="24"/>
+                <w:u w:val="none"/>
+              </w:rPr>
+            </w:pPr>
+            <w:r>
+              <w:rPr>
+                <w:rFonts w:hint="eastAsia" w:ascii="宋体" w:hAnsi="宋体" w:eastAsia="宋体" w:cs="宋体"/>
+                <w:i w:val="0"/>
+                <w:iCs w:val="0"/>
+                <w:color w:val="000000"/>
+                <w:kern w:val="0"/>
+                <w:sz w:val="24"/>
+                <w:szCs w:val="24"/>
+                <w:u w:val="none"/>
+                <w:lang w:val="en-US" w:eastAsia="zh-CN" w:bidi="ar"/>
+              </w:rPr>
+              <w:t>7</w:t>
+            </w:r>
+          </w:p>
+        </w:tc>
+        <w:tc>
+          <w:tcPr>
+            <w:tcW w:w="2015" w:type="pct"/>
+            <w:tcBorders>
+              <w:top w:val="single" w:color="000000" w:sz="4" w:space="0"/>
+              <w:left w:val="single" w:color="000000" w:sz="4" w:space="0"/>
+              <w:bottom w:val="single" w:color="000000" w:sz="4" w:space="0"/>
+              <w:right w:val="single" w:color="000000" w:sz="4" w:space="0"/>
+            </w:tcBorders>
+            <w:shd w:val="clear" w:color="auto" w:fill="auto"/>
+            <w:noWrap/>
+            <w:vAlign w:val="center"/>
+          </w:tcPr>
+          <w:p>
+            <w:pPr>
+              <w:keepNext w:val="0"/>
+              <w:keepLines w:val="0"/>
+              <w:widowControl/>
+              <w:suppressLineNumbers w:val="0"/>
+              <w:ind w:left="0" w:leftChars="0" w:firstLine="0" w:firstLineChars="0"/>
+              <w:jc w:val="center"/>
+              <w:textAlignment w:val="center"/>
+              <w:rPr>
+                <w:rFonts w:hint="eastAsia" w:ascii="宋体" w:hAnsi="宋体" w:eastAsia="宋体" w:cs="宋体"/>
+                <w:i w:val="0"/>
+                <w:iCs w:val="0"/>
+                <w:color w:val="000000"/>
+                <w:sz w:val="24"/>
+                <w:szCs w:val="24"/>
+                <w:u w:val="none"/>
+              </w:rPr>
+            </w:pPr>
+            <w:r>
+              <w:rPr>
+                <w:rFonts w:hint="eastAsia" w:ascii="宋体" w:hAnsi="宋体" w:eastAsia="宋体" w:cs="宋体"/>
+                <w:i w:val="0"/>
+                <w:iCs w:val="0"/>
+                <w:color w:val="000000"/>
+                <w:kern w:val="0"/>
+                <w:sz w:val="24"/>
+                <w:szCs w:val="24"/>
+                <w:u w:val="none"/>
+                <w:lang w:val="en-US" w:eastAsia="zh-CN" w:bidi="ar"/>
+              </w:rPr>
+              <w:t>负一层停车场</w:t>
+            </w:r>
+          </w:p>
+        </w:tc>
+        <w:tc>
+          <w:tcPr>
+            <w:tcW w:w="1809" w:type="pct"/>
+            <w:tcBorders>
+              <w:top w:val="single" w:color="000000" w:sz="4" w:space="0"/>
+              <w:left w:val="single" w:color="000000" w:sz="4" w:space="0"/>
+              <w:bottom w:val="single" w:color="000000" w:sz="4" w:space="0"/>
+              <w:right w:val="single" w:color="000000" w:sz="4" w:space="0"/>
+            </w:tcBorders>
+            <w:shd w:val="clear" w:color="auto" w:fill="auto"/>
+            <w:noWrap/>
+            <w:vAlign w:val="center"/>
+          </w:tcPr>
+          <w:p>
+            <w:pPr>
+              <w:keepNext w:val="0"/>
+              <w:keepLines w:val="0"/>
+              <w:widowControl/>
+              <w:suppressLineNumbers w:val="0"/>
+              <w:ind w:left="0" w:leftChars="0" w:firstLine="0" w:firstLineChars="0"/>
+              <w:jc w:val="center"/>
+              <w:textAlignment w:val="center"/>
+              <w:rPr>
+                <w:rFonts w:hint="eastAsia" w:ascii="宋体" w:hAnsi="宋体" w:eastAsia="宋体" w:cs="宋体"/>
+                <w:i w:val="0"/>
+                <w:iCs w:val="0"/>
+                <w:color w:val="000000"/>
+                <w:sz w:val="24"/>
+                <w:szCs w:val="24"/>
+                <w:u w:val="none"/>
+              </w:rPr>
+            </w:pPr>
+            <w:r>
+              <w:rPr>
+                <w:rFonts w:hint="eastAsia" w:ascii="宋体" w:hAnsi="宋体" w:eastAsia="宋体" w:cs="宋体"/>
+                <w:i w:val="0"/>
+                <w:iCs w:val="0"/>
+                <w:color w:val="000000"/>
+                <w:kern w:val="0"/>
+                <w:sz w:val="24"/>
+                <w:szCs w:val="24"/>
+                <w:u w:val="none"/>
+                <w:lang w:val="en-US" w:eastAsia="zh-CN" w:bidi="ar"/>
+              </w:rPr>
+              <w:t>14000</w:t>
             </w:r>
           </w:p>
         </w:tc>
@@ -1872,7 +2173,7 @@
               <w:bottom w:val="single" w:color="000000" w:sz="4" w:space="0"/>
               <w:right w:val="single" w:color="000000" w:sz="4" w:space="0"/>
             </w:tcBorders>
-            <w:shd w:val="clear"/>
+            <w:shd w:val="clear" w:color="auto" w:fill="auto"/>
             <w:noWrap/>
             <w:vAlign w:val="center"/>
           </w:tcPr>
@@ -1905,10 +2206,9 @@
                 <w:sz w:val="24"/>
                 <w:szCs w:val="24"/>
                 <w:u w:val="none"/>
-                <w:bdr w:val="none" w:color="auto" w:sz="0" w:space="0"/>
                 <w:lang w:val="en-US" w:eastAsia="zh-CN" w:bidi="ar"/>
               </w:rPr>
-              <w:t>6</w:t>
+              <w:t>8</w:t>
             </w:r>
           </w:p>
         </w:tc>
@@ -1921,7 +2221,7 @@
               <w:bottom w:val="single" w:color="000000" w:sz="4" w:space="0"/>
               <w:right w:val="single" w:color="000000" w:sz="4" w:space="0"/>
             </w:tcBorders>
-            <w:shd w:val="clear"/>
+            <w:shd w:val="clear" w:color="auto" w:fill="auto"/>
             <w:noWrap/>
             <w:vAlign w:val="center"/>
           </w:tcPr>
@@ -1954,10 +2254,9 @@
                 <w:sz w:val="24"/>
                 <w:szCs w:val="24"/>
                 <w:u w:val="none"/>
-                <w:bdr w:val="none" w:color="auto" w:sz="0" w:space="0"/>
                 <w:lang w:val="en-US" w:eastAsia="zh-CN" w:bidi="ar"/>
               </w:rPr>
-              <w:t>B座屋顶</w:t>
+              <w:t>食堂</w:t>
             </w:r>
           </w:p>
         </w:tc>
@@ -1970,7 +2269,7 @@
               <w:bottom w:val="single" w:color="000000" w:sz="4" w:space="0"/>
               <w:right w:val="single" w:color="000000" w:sz="4" w:space="0"/>
             </w:tcBorders>
-            <w:shd w:val="clear"/>
+            <w:shd w:val="clear" w:color="auto" w:fill="auto"/>
             <w:noWrap/>
             <w:vAlign w:val="center"/>
           </w:tcPr>
@@ -2003,10 +2302,9 @@
                 <w:sz w:val="24"/>
                 <w:szCs w:val="24"/>
                 <w:u w:val="none"/>
-                <w:bdr w:val="none" w:color="auto" w:sz="0" w:space="0"/>
                 <w:lang w:val="en-US" w:eastAsia="zh-CN" w:bidi="ar"/>
               </w:rPr>
-              <w:t>800</w:t>
+              <w:t>330</w:t>
             </w:r>
           </w:p>
         </w:tc>
@@ -2021,6 +2319,7 @@
             <w:insideH w:val="none" w:color="auto" w:sz="0" w:space="0"/>
             <w:insideV w:val="none" w:color="auto" w:sz="0" w:space="0"/>
           </w:tblBorders>
+          <w:shd w:val="clear" w:color="auto" w:fill="auto"/>
           <w:tblCellMar>
             <w:top w:w="0" w:type="dxa"/>
             <w:left w:w="108" w:type="dxa"/>
@@ -2040,7 +2339,7 @@
               <w:bottom w:val="single" w:color="000000" w:sz="4" w:space="0"/>
               <w:right w:val="single" w:color="000000" w:sz="4" w:space="0"/>
             </w:tcBorders>
-            <w:shd w:val="clear"/>
+            <w:shd w:val="clear" w:color="auto" w:fill="auto"/>
             <w:noWrap/>
             <w:vAlign w:val="center"/>
           </w:tcPr>
@@ -2073,10 +2372,9 @@
                 <w:sz w:val="24"/>
                 <w:szCs w:val="24"/>
                 <w:u w:val="none"/>
-                <w:bdr w:val="none" w:color="auto" w:sz="0" w:space="0"/>
                 <w:lang w:val="en-US" w:eastAsia="zh-CN" w:bidi="ar"/>
               </w:rPr>
-              <w:t>7</w:t>
+              <w:t>9</w:t>
             </w:r>
           </w:p>
         </w:tc>
@@ -2089,7 +2387,7 @@
               <w:bottom w:val="single" w:color="000000" w:sz="4" w:space="0"/>
               <w:right w:val="single" w:color="000000" w:sz="4" w:space="0"/>
             </w:tcBorders>
-            <w:shd w:val="clear"/>
+            <w:shd w:val="clear" w:color="auto" w:fill="auto"/>
             <w:noWrap/>
             <w:vAlign w:val="center"/>
           </w:tcPr>
@@ -2122,10 +2420,9 @@
                 <w:sz w:val="24"/>
                 <w:szCs w:val="24"/>
                 <w:u w:val="none"/>
-                <w:bdr w:val="none" w:color="auto" w:sz="0" w:space="0"/>
                 <w:lang w:val="en-US" w:eastAsia="zh-CN" w:bidi="ar"/>
               </w:rPr>
-              <w:t>负一层停车场</w:t>
+              <w:t>会议中心</w:t>
             </w:r>
           </w:p>
         </w:tc>
@@ -2138,7 +2435,7 @@
               <w:bottom w:val="single" w:color="000000" w:sz="4" w:space="0"/>
               <w:right w:val="single" w:color="000000" w:sz="4" w:space="0"/>
             </w:tcBorders>
-            <w:shd w:val="clear"/>
+            <w:shd w:val="clear" w:color="auto" w:fill="auto"/>
             <w:noWrap/>
             <w:vAlign w:val="center"/>
           </w:tcPr>
@@ -2171,10 +2468,9 @@
                 <w:sz w:val="24"/>
                 <w:szCs w:val="24"/>
                 <w:u w:val="none"/>
-                <w:bdr w:val="none" w:color="auto" w:sz="0" w:space="0"/>
                 <w:lang w:val="en-US" w:eastAsia="zh-CN" w:bidi="ar"/>
               </w:rPr>
-              <w:t>14000</w:t>
+              <w:t>780</w:t>
             </w:r>
           </w:p>
         </w:tc>
@@ -2189,7 +2485,7 @@
             <w:insideH w:val="none" w:color="auto" w:sz="0" w:space="0"/>
             <w:insideV w:val="none" w:color="auto" w:sz="0" w:space="0"/>
           </w:tblBorders>
-          <w:shd w:val="clear"/>
+          <w:shd w:val="clear" w:color="auto" w:fill="auto"/>
           <w:tblCellMar>
             <w:top w:w="0" w:type="dxa"/>
             <w:left w:w="108" w:type="dxa"/>
@@ -2209,7 +2505,7 @@
               <w:bottom w:val="single" w:color="000000" w:sz="4" w:space="0"/>
               <w:right w:val="single" w:color="000000" w:sz="4" w:space="0"/>
             </w:tcBorders>
-            <w:shd w:val="clear"/>
+            <w:shd w:val="clear" w:color="auto" w:fill="auto"/>
             <w:noWrap/>
             <w:vAlign w:val="center"/>
           </w:tcPr>
@@ -2242,10 +2538,9 @@
                 <w:sz w:val="24"/>
                 <w:szCs w:val="24"/>
                 <w:u w:val="none"/>
-                <w:bdr w:val="none" w:color="auto" w:sz="0" w:space="0"/>
                 <w:lang w:val="en-US" w:eastAsia="zh-CN" w:bidi="ar"/>
               </w:rPr>
-              <w:t>8</w:t>
+              <w:t>10</w:t>
             </w:r>
           </w:p>
         </w:tc>
@@ -2258,7 +2553,7 @@
               <w:bottom w:val="single" w:color="000000" w:sz="4" w:space="0"/>
               <w:right w:val="single" w:color="000000" w:sz="4" w:space="0"/>
             </w:tcBorders>
-            <w:shd w:val="clear"/>
+            <w:shd w:val="clear" w:color="auto" w:fill="auto"/>
             <w:noWrap/>
             <w:vAlign w:val="center"/>
           </w:tcPr>
@@ -2291,10 +2586,9 @@
                 <w:sz w:val="24"/>
                 <w:szCs w:val="24"/>
                 <w:u w:val="none"/>
-                <w:bdr w:val="none" w:color="auto" w:sz="0" w:space="0"/>
                 <w:lang w:val="en-US" w:eastAsia="zh-CN" w:bidi="ar"/>
               </w:rPr>
-              <w:t>食堂</w:t>
+              <w:t>智慧厅</w:t>
             </w:r>
           </w:p>
         </w:tc>
@@ -2307,7 +2601,7 @@
               <w:bottom w:val="single" w:color="000000" w:sz="4" w:space="0"/>
               <w:right w:val="single" w:color="000000" w:sz="4" w:space="0"/>
             </w:tcBorders>
-            <w:shd w:val="clear"/>
+            <w:shd w:val="clear" w:color="auto" w:fill="auto"/>
             <w:noWrap/>
             <w:vAlign w:val="center"/>
           </w:tcPr>
@@ -2340,343 +2634,6 @@
                 <w:sz w:val="24"/>
                 <w:szCs w:val="24"/>
                 <w:u w:val="none"/>
-                <w:bdr w:val="none" w:color="auto" w:sz="0" w:space="0"/>
-                <w:lang w:val="en-US" w:eastAsia="zh-CN" w:bidi="ar"/>
-              </w:rPr>
-              <w:t>330</w:t>
-            </w:r>
-          </w:p>
-        </w:tc>
-      </w:tr>
-      <w:tr>
-        <w:tblPrEx>
-          <w:tblBorders>
-            <w:top w:val="none" w:color="auto" w:sz="0" w:space="0"/>
-            <w:left w:val="none" w:color="auto" w:sz="0" w:space="0"/>
-            <w:bottom w:val="none" w:color="auto" w:sz="0" w:space="0"/>
-            <w:right w:val="none" w:color="auto" w:sz="0" w:space="0"/>
-            <w:insideH w:val="none" w:color="auto" w:sz="0" w:space="0"/>
-            <w:insideV w:val="none" w:color="auto" w:sz="0" w:space="0"/>
-          </w:tblBorders>
-          <w:tblCellMar>
-            <w:top w:w="0" w:type="dxa"/>
-            <w:left w:w="108" w:type="dxa"/>
-            <w:bottom w:w="0" w:type="dxa"/>
-            <w:right w:w="108" w:type="dxa"/>
-          </w:tblCellMar>
-        </w:tblPrEx>
-        <w:trPr>
-          <w:trHeight w:val="699" w:hRule="atLeast"/>
-        </w:trPr>
-        <w:tc>
-          <w:tcPr>
-            <w:tcW w:w="1174" w:type="pct"/>
-            <w:tcBorders>
-              <w:top w:val="single" w:color="000000" w:sz="4" w:space="0"/>
-              <w:left w:val="single" w:color="000000" w:sz="4" w:space="0"/>
-              <w:bottom w:val="single" w:color="000000" w:sz="4" w:space="0"/>
-              <w:right w:val="single" w:color="000000" w:sz="4" w:space="0"/>
-            </w:tcBorders>
-            <w:shd w:val="clear"/>
-            <w:noWrap/>
-            <w:vAlign w:val="center"/>
-          </w:tcPr>
-          <w:p>
-            <w:pPr>
-              <w:keepNext w:val="0"/>
-              <w:keepLines w:val="0"/>
-              <w:widowControl/>
-              <w:suppressLineNumbers w:val="0"/>
-              <w:ind w:left="0" w:leftChars="0" w:firstLine="0" w:firstLineChars="0"/>
-              <w:jc w:val="center"/>
-              <w:textAlignment w:val="center"/>
-              <w:rPr>
-                <w:rFonts w:hint="eastAsia" w:ascii="宋体" w:hAnsi="宋体" w:eastAsia="宋体" w:cs="宋体"/>
-                <w:i w:val="0"/>
-                <w:iCs w:val="0"/>
-                <w:color w:val="000000"/>
-                <w:sz w:val="24"/>
-                <w:szCs w:val="24"/>
-                <w:u w:val="none"/>
-              </w:rPr>
-            </w:pPr>
-            <w:r>
-              <w:rPr>
-                <w:rFonts w:hint="eastAsia" w:ascii="宋体" w:hAnsi="宋体" w:eastAsia="宋体" w:cs="宋体"/>
-                <w:i w:val="0"/>
-                <w:iCs w:val="0"/>
-                <w:color w:val="000000"/>
-                <w:kern w:val="0"/>
-                <w:sz w:val="24"/>
-                <w:szCs w:val="24"/>
-                <w:u w:val="none"/>
-                <w:bdr w:val="none" w:color="auto" w:sz="0" w:space="0"/>
-                <w:lang w:val="en-US" w:eastAsia="zh-CN" w:bidi="ar"/>
-              </w:rPr>
-              <w:t>9</w:t>
-            </w:r>
-          </w:p>
-        </w:tc>
-        <w:tc>
-          <w:tcPr>
-            <w:tcW w:w="2015" w:type="pct"/>
-            <w:tcBorders>
-              <w:top w:val="single" w:color="000000" w:sz="4" w:space="0"/>
-              <w:left w:val="single" w:color="000000" w:sz="4" w:space="0"/>
-              <w:bottom w:val="single" w:color="000000" w:sz="4" w:space="0"/>
-              <w:right w:val="single" w:color="000000" w:sz="4" w:space="0"/>
-            </w:tcBorders>
-            <w:shd w:val="clear"/>
-            <w:noWrap/>
-            <w:vAlign w:val="center"/>
-          </w:tcPr>
-          <w:p>
-            <w:pPr>
-              <w:keepNext w:val="0"/>
-              <w:keepLines w:val="0"/>
-              <w:widowControl/>
-              <w:suppressLineNumbers w:val="0"/>
-              <w:ind w:left="0" w:leftChars="0" w:firstLine="0" w:firstLineChars="0"/>
-              <w:jc w:val="center"/>
-              <w:textAlignment w:val="center"/>
-              <w:rPr>
-                <w:rFonts w:hint="eastAsia" w:ascii="宋体" w:hAnsi="宋体" w:eastAsia="宋体" w:cs="宋体"/>
-                <w:i w:val="0"/>
-                <w:iCs w:val="0"/>
-                <w:color w:val="000000"/>
-                <w:sz w:val="24"/>
-                <w:szCs w:val="24"/>
-                <w:u w:val="none"/>
-              </w:rPr>
-            </w:pPr>
-            <w:r>
-              <w:rPr>
-                <w:rFonts w:hint="eastAsia" w:ascii="宋体" w:hAnsi="宋体" w:eastAsia="宋体" w:cs="宋体"/>
-                <w:i w:val="0"/>
-                <w:iCs w:val="0"/>
-                <w:color w:val="000000"/>
-                <w:kern w:val="0"/>
-                <w:sz w:val="24"/>
-                <w:szCs w:val="24"/>
-                <w:u w:val="none"/>
-                <w:bdr w:val="none" w:color="auto" w:sz="0" w:space="0"/>
-                <w:lang w:val="en-US" w:eastAsia="zh-CN" w:bidi="ar"/>
-              </w:rPr>
-              <w:t>会议中心</w:t>
-            </w:r>
-          </w:p>
-        </w:tc>
-        <w:tc>
-          <w:tcPr>
-            <w:tcW w:w="1809" w:type="pct"/>
-            <w:tcBorders>
-              <w:top w:val="single" w:color="000000" w:sz="4" w:space="0"/>
-              <w:left w:val="single" w:color="000000" w:sz="4" w:space="0"/>
-              <w:bottom w:val="single" w:color="000000" w:sz="4" w:space="0"/>
-              <w:right w:val="single" w:color="000000" w:sz="4" w:space="0"/>
-            </w:tcBorders>
-            <w:shd w:val="clear"/>
-            <w:noWrap/>
-            <w:vAlign w:val="center"/>
-          </w:tcPr>
-          <w:p>
-            <w:pPr>
-              <w:keepNext w:val="0"/>
-              <w:keepLines w:val="0"/>
-              <w:widowControl/>
-              <w:suppressLineNumbers w:val="0"/>
-              <w:ind w:left="0" w:leftChars="0" w:firstLine="0" w:firstLineChars="0"/>
-              <w:jc w:val="center"/>
-              <w:textAlignment w:val="center"/>
-              <w:rPr>
-                <w:rFonts w:hint="eastAsia" w:ascii="宋体" w:hAnsi="宋体" w:eastAsia="宋体" w:cs="宋体"/>
-                <w:i w:val="0"/>
-                <w:iCs w:val="0"/>
-                <w:color w:val="000000"/>
-                <w:sz w:val="24"/>
-                <w:szCs w:val="24"/>
-                <w:u w:val="none"/>
-              </w:rPr>
-            </w:pPr>
-            <w:r>
-              <w:rPr>
-                <w:rFonts w:hint="eastAsia" w:ascii="宋体" w:hAnsi="宋体" w:eastAsia="宋体" w:cs="宋体"/>
-                <w:i w:val="0"/>
-                <w:iCs w:val="0"/>
-                <w:color w:val="000000"/>
-                <w:kern w:val="0"/>
-                <w:sz w:val="24"/>
-                <w:szCs w:val="24"/>
-                <w:u w:val="none"/>
-                <w:bdr w:val="none" w:color="auto" w:sz="0" w:space="0"/>
-                <w:lang w:val="en-US" w:eastAsia="zh-CN" w:bidi="ar"/>
-              </w:rPr>
-              <w:t>780</w:t>
-            </w:r>
-          </w:p>
-        </w:tc>
-      </w:tr>
-      <w:tr>
-        <w:tblPrEx>
-          <w:tblBorders>
-            <w:top w:val="none" w:color="auto" w:sz="0" w:space="0"/>
-            <w:left w:val="none" w:color="auto" w:sz="0" w:space="0"/>
-            <w:bottom w:val="none" w:color="auto" w:sz="0" w:space="0"/>
-            <w:right w:val="none" w:color="auto" w:sz="0" w:space="0"/>
-            <w:insideH w:val="none" w:color="auto" w:sz="0" w:space="0"/>
-            <w:insideV w:val="none" w:color="auto" w:sz="0" w:space="0"/>
-          </w:tblBorders>
-          <w:tblCellMar>
-            <w:top w:w="0" w:type="dxa"/>
-            <w:left w:w="108" w:type="dxa"/>
-            <w:bottom w:w="0" w:type="dxa"/>
-            <w:right w:w="108" w:type="dxa"/>
-          </w:tblCellMar>
-        </w:tblPrEx>
-        <w:trPr>
-          <w:trHeight w:val="699" w:hRule="atLeast"/>
-        </w:trPr>
-        <w:tc>
-          <w:tcPr>
-            <w:tcW w:w="1174" w:type="pct"/>
-            <w:tcBorders>
-              <w:top w:val="single" w:color="000000" w:sz="4" w:space="0"/>
-              <w:left w:val="single" w:color="000000" w:sz="4" w:space="0"/>
-              <w:bottom w:val="single" w:color="000000" w:sz="4" w:space="0"/>
-              <w:right w:val="single" w:color="000000" w:sz="4" w:space="0"/>
-            </w:tcBorders>
-            <w:shd w:val="clear"/>
-            <w:noWrap/>
-            <w:vAlign w:val="center"/>
-          </w:tcPr>
-          <w:p>
-            <w:pPr>
-              <w:keepNext w:val="0"/>
-              <w:keepLines w:val="0"/>
-              <w:widowControl/>
-              <w:suppressLineNumbers w:val="0"/>
-              <w:ind w:left="0" w:leftChars="0" w:firstLine="0" w:firstLineChars="0"/>
-              <w:jc w:val="center"/>
-              <w:textAlignment w:val="center"/>
-              <w:rPr>
-                <w:rFonts w:hint="eastAsia" w:ascii="宋体" w:hAnsi="宋体" w:eastAsia="宋体" w:cs="宋体"/>
-                <w:i w:val="0"/>
-                <w:iCs w:val="0"/>
-                <w:color w:val="000000"/>
-                <w:sz w:val="24"/>
-                <w:szCs w:val="24"/>
-                <w:u w:val="none"/>
-              </w:rPr>
-            </w:pPr>
-            <w:r>
-              <w:rPr>
-                <w:rFonts w:hint="eastAsia" w:ascii="宋体" w:hAnsi="宋体" w:eastAsia="宋体" w:cs="宋体"/>
-                <w:i w:val="0"/>
-                <w:iCs w:val="0"/>
-                <w:color w:val="000000"/>
-                <w:kern w:val="0"/>
-                <w:sz w:val="24"/>
-                <w:szCs w:val="24"/>
-                <w:u w:val="none"/>
-                <w:bdr w:val="none" w:color="auto" w:sz="0" w:space="0"/>
-                <w:lang w:val="en-US" w:eastAsia="zh-CN" w:bidi="ar"/>
-              </w:rPr>
-              <w:t>10</w:t>
-            </w:r>
-          </w:p>
-        </w:tc>
-        <w:tc>
-          <w:tcPr>
-            <w:tcW w:w="2015" w:type="pct"/>
-            <w:tcBorders>
-              <w:top w:val="single" w:color="000000" w:sz="4" w:space="0"/>
-              <w:left w:val="single" w:color="000000" w:sz="4" w:space="0"/>
-              <w:bottom w:val="single" w:color="000000" w:sz="4" w:space="0"/>
-              <w:right w:val="single" w:color="000000" w:sz="4" w:space="0"/>
-            </w:tcBorders>
-            <w:shd w:val="clear"/>
-            <w:noWrap/>
-            <w:vAlign w:val="center"/>
-          </w:tcPr>
-          <w:p>
-            <w:pPr>
-              <w:keepNext w:val="0"/>
-              <w:keepLines w:val="0"/>
-              <w:widowControl/>
-              <w:suppressLineNumbers w:val="0"/>
-              <w:ind w:left="0" w:leftChars="0" w:firstLine="0" w:firstLineChars="0"/>
-              <w:jc w:val="center"/>
-              <w:textAlignment w:val="center"/>
-              <w:rPr>
-                <w:rFonts w:hint="eastAsia" w:ascii="宋体" w:hAnsi="宋体" w:eastAsia="宋体" w:cs="宋体"/>
-                <w:i w:val="0"/>
-                <w:iCs w:val="0"/>
-                <w:color w:val="000000"/>
-                <w:sz w:val="24"/>
-                <w:szCs w:val="24"/>
-                <w:u w:val="none"/>
-              </w:rPr>
-            </w:pPr>
-            <w:r>
-              <w:rPr>
-                <w:rFonts w:hint="eastAsia" w:ascii="宋体" w:hAnsi="宋体" w:eastAsia="宋体" w:cs="宋体"/>
-                <w:i w:val="0"/>
-                <w:iCs w:val="0"/>
-                <w:color w:val="000000"/>
-                <w:kern w:val="0"/>
-                <w:sz w:val="24"/>
-                <w:szCs w:val="24"/>
-                <w:u w:val="none"/>
-                <w:bdr w:val="none" w:color="auto" w:sz="0" w:space="0"/>
-                <w:lang w:val="en-US" w:eastAsia="zh-CN" w:bidi="ar"/>
-              </w:rPr>
-              <w:t>智慧厅</w:t>
-            </w:r>
-          </w:p>
-        </w:tc>
-        <w:tc>
-          <w:tcPr>
-            <w:tcW w:w="1809" w:type="pct"/>
-            <w:tcBorders>
-              <w:top w:val="single" w:color="000000" w:sz="4" w:space="0"/>
-              <w:left w:val="single" w:color="000000" w:sz="4" w:space="0"/>
-              <w:bottom w:val="single" w:color="000000" w:sz="4" w:space="0"/>
-              <w:right w:val="single" w:color="000000" w:sz="4" w:space="0"/>
-            </w:tcBorders>
-            <w:shd w:val="clear"/>
-            <w:noWrap/>
-            <w:vAlign w:val="center"/>
-          </w:tcPr>
-          <w:p>
-            <w:pPr>
-              <w:keepNext w:val="0"/>
-              <w:keepLines w:val="0"/>
-              <w:widowControl/>
-              <w:suppressLineNumbers w:val="0"/>
-              <w:ind w:left="0" w:leftChars="0" w:firstLine="0" w:firstLineChars="0"/>
-              <w:jc w:val="center"/>
-              <w:textAlignment w:val="center"/>
-              <w:rPr>
-                <w:rFonts w:hint="eastAsia" w:ascii="宋体" w:hAnsi="宋体" w:eastAsia="宋体" w:cs="宋体"/>
-                <w:i w:val="0"/>
-                <w:iCs w:val="0"/>
-                <w:color w:val="000000"/>
-                <w:sz w:val="24"/>
-                <w:szCs w:val="24"/>
-                <w:u w:val="none"/>
-              </w:rPr>
-            </w:pPr>
-            <w:r>
-              <w:rPr>
-                <w:rFonts w:hint="eastAsia" w:ascii="宋体" w:hAnsi="宋体" w:eastAsia="宋体" w:cs="宋体"/>
-                <w:i w:val="0"/>
-                <w:iCs w:val="0"/>
-                <w:color w:val="000000"/>
-                <w:kern w:val="0"/>
-                <w:sz w:val="24"/>
-                <w:szCs w:val="24"/>
-                <w:u w:val="none"/>
-                <w:bdr w:val="none" w:color="auto" w:sz="0" w:space="0"/>
                 <w:lang w:val="en-US" w:eastAsia="zh-CN" w:bidi="ar"/>
               </w:rPr>
               <w:t>370</w:t>
@@ -2713,7 +2670,7 @@
               <w:bottom w:val="single" w:color="000000" w:sz="4" w:space="0"/>
               <w:right w:val="single" w:color="000000" w:sz="4" w:space="0"/>
             </w:tcBorders>
-            <w:shd w:val="clear"/>
+            <w:shd w:val="clear" w:color="auto" w:fill="auto"/>
             <w:noWrap/>
             <w:vAlign w:val="center"/>
           </w:tcPr>
@@ -2741,7 +2698,7 @@
               <w:bottom w:val="single" w:color="000000" w:sz="4" w:space="0"/>
               <w:right w:val="single" w:color="000000" w:sz="4" w:space="0"/>
             </w:tcBorders>
-            <w:shd w:val="clear"/>
+            <w:shd w:val="clear" w:color="auto" w:fill="auto"/>
             <w:noWrap/>
             <w:vAlign w:val="center"/>
           </w:tcPr>
@@ -2774,7 +2731,6 @@
                 <w:sz w:val="24"/>
                 <w:szCs w:val="24"/>
                 <w:u w:val="none"/>
-                <w:bdr w:val="none" w:color="auto" w:sz="0" w:space="0"/>
                 <w:lang w:val="en-US" w:eastAsia="zh-CN" w:bidi="ar"/>
               </w:rPr>
               <w:t>合计</w:t>
@@ -2790,7 +2746,7 @@
               <w:bottom w:val="single" w:color="000000" w:sz="4" w:space="0"/>
               <w:right w:val="single" w:color="000000" w:sz="4" w:space="0"/>
             </w:tcBorders>
-            <w:shd w:val="clear"/>
+            <w:shd w:val="clear" w:color="auto" w:fill="auto"/>
             <w:noWrap/>
             <w:vAlign w:val="center"/>
           </w:tcPr>
@@ -2823,7 +2779,6 @@
                 <w:sz w:val="24"/>
                 <w:szCs w:val="24"/>
                 <w:u w:val="none"/>
-                <w:bdr w:val="none" w:color="auto" w:sz="0" w:space="0"/>
                 <w:lang w:val="en-US" w:eastAsia="zh-CN" w:bidi="ar"/>
               </w:rPr>
               <w:t>20130</w:t>
@@ -2890,8 +2845,6 @@
         </w:rPr>
         <w:t>提升内容</w:t>
       </w:r>
-      <w:bookmarkStart w:id="0" w:name="_GoBack"/>
-      <w:bookmarkEnd w:id="0"/>
     </w:p>
     <w:p>
       <w:pPr>
@@ -2910,7 +2863,6 @@
           <w:rFonts w:hint="eastAsia"/>
           <w:b/>
           <w:sz w:val="32"/>
-          <w:noProof/>
         </w:rPr>
         <w:t>“镜览科创，定格美好”摄影展活动</w:t>
       </w:r>
@@ -2922,7 +2874,6 @@
       <w:r>
         <w:rPr>
           <w:rFonts w:hint="eastAsia"/>
-          <w:noProof/>
         </w:rPr>
         <w:t>摄影展活动现场</w:t>
       </w:r>
@@ -3012,7 +2963,6 @@
       <w:r>
         <w:rPr>
           <w:rFonts w:hint="eastAsia"/>
-          <w:noProof/>
         </w:rPr>
         <w:t>一等奖　平凡岗位，坚守不分晨昏</w:t>
       </w:r>
@@ -3106,313 +3056,6 @@
             </a:graphic>
           </wp:inline>
         </w:drawing>
-      </w:r>
-    </w:p>
-    <w:p>
-      <w:pPr>
-        <w:jc w:val="both"/>
-      </w:pPr>
-      <w:r>
-        <w:rPr>
-          <w:rFonts w:hint="eastAsia"/>
-          <w:noProof/>
-        </w:rPr>
-        <w:t>二等奖　交投晚霞</w:t>
-      </w:r>
-    </w:p>
-    <w:p>
-      <w:pPr>
-        <w:jc w:val="both"/>
-      </w:pPr>
-      <w:r>
-        <w:drawing>
-          <wp:anchor distT="0" distB="0" distL="0" distR="0" simplePos="0" relativeHeight="251661312" behindDoc="1" locked="0" layoutInCell="1" allowOverlap="1">
-            <wp:simplePos x="0" y="0"/>
-            <wp:positionH relativeFrom="column">
-              <wp:posOffset>301625</wp:posOffset>
-            </wp:positionH>
-            <wp:positionV relativeFrom="paragraph">
-              <wp:posOffset>149225</wp:posOffset>
-            </wp:positionV>
-            <wp:extent cx="4819650" cy="3619500"/>
-            <wp:effectExtent l="0" t="0" r="0" b="0"/>
-            <wp:wrapTight wrapText="bothSides">
-              <wp:wrapPolygon>
-                <wp:start x="0" y="0"/>
-                <wp:lineTo x="0" y="21555"/>
-                <wp:lineTo x="21515" y="21555"/>
-                <wp:lineTo x="21515" y="0"/>
-                <wp:lineTo x="0" y="0"/>
-              </wp:wrapPolygon>
-            </wp:wrapTight>
-            <wp:docPr id="11" name="picture"/>
-            <wp:cNvGraphicFramePr/>
-            <a:graphic xmlns:a="http://schemas.openxmlformats.org/drawingml/2006/main">
-              <a:graphicData uri="http://schemas.openxmlformats.org/drawingml/2006/picture">
-                <pic:pic xmlns:pic="http://schemas.openxmlformats.org/drawingml/2006/picture">
-                  <pic:nvPicPr>
-                    <pic:cNvPr id="11" name="picture"/>
-                    <pic:cNvPicPr/>
-                  </pic:nvPicPr>
-                  <pic:blipFill>
-                    <a:blip r:embed="rId9"/>
-                    <a:stretch>
-                      <a:fillRect/>
-                    </a:stretch>
-                  </pic:blipFill>
-                  <pic:spPr>
-                    <a:xfrm>
-                      <a:off x="0" y="0"/>
-                      <a:ext cx="4819650" cy="3619500"/>
-                    </a:xfrm>
-                    <a:prstGeom prst="rect">
-                      <a:avLst/>
-                    </a:prstGeom>
-                  </pic:spPr>
-                </pic:pic>
-              </a:graphicData>
-            </a:graphic>
-          </wp:anchor>
-        </w:drawing>
-      </w:r>
-    </w:p>
-    <w:p>
-      <w:pPr>
-        <w:jc w:val="both"/>
-      </w:pPr>
-      <w:r>
-        <w:rPr>
-          <w:rFonts w:hint="eastAsia"/>
-          <w:noProof/>
-        </w:rPr>
-        <w:t>二等奖　以镜为媒，览科创风华</w:t>
-      </w:r>
-    </w:p>
-    <w:p>
-      <w:pPr>
-        <w:jc w:val="both"/>
-      </w:pPr>
-      <w:r>
-        <w:drawing>
-          <wp:anchor distT="0" distB="0" distL="0" distR="0" simplePos="0" relativeHeight="251662336" behindDoc="1" locked="0" layoutInCell="1" allowOverlap="1">
-            <wp:simplePos x="0" y="0"/>
-            <wp:positionH relativeFrom="column">
-              <wp:posOffset>169545</wp:posOffset>
-            </wp:positionH>
-            <wp:positionV relativeFrom="paragraph">
-              <wp:posOffset>116205</wp:posOffset>
-            </wp:positionV>
-            <wp:extent cx="4819650" cy="3619500"/>
-            <wp:effectExtent l="0" t="0" r="0" b="0"/>
-            <wp:wrapTight wrapText="bothSides">
-              <wp:wrapPolygon>
-                <wp:start x="0" y="0"/>
-                <wp:lineTo x="0" y="21555"/>
-                <wp:lineTo x="21515" y="21555"/>
-                <wp:lineTo x="21515" y="0"/>
-                <wp:lineTo x="0" y="0"/>
-              </wp:wrapPolygon>
-            </wp:wrapTight>
-            <wp:docPr id="14" name="picture"/>
-            <wp:cNvGraphicFramePr/>
-            <a:graphic xmlns:a="http://schemas.openxmlformats.org/drawingml/2006/main">
-              <a:graphicData uri="http://schemas.openxmlformats.org/drawingml/2006/picture">
-                <pic:pic xmlns:pic="http://schemas.openxmlformats.org/drawingml/2006/picture">
-                  <pic:nvPicPr>
-                    <pic:cNvPr id="14" name="picture"/>
-                    <pic:cNvPicPr/>
-                  </pic:nvPicPr>
-                  <pic:blipFill>
-                    <a:blip r:embed="rId10"/>
-                    <a:stretch>
-                      <a:fillRect/>
-                    </a:stretch>
-                  </pic:blipFill>
-                  <pic:spPr>
-                    <a:xfrm>
-                      <a:off x="0" y="0"/>
-                      <a:ext cx="4819650" cy="3619500"/>
-                    </a:xfrm>
-                    <a:prstGeom prst="rect">
-                      <a:avLst/>
-                    </a:prstGeom>
-                  </pic:spPr>
-                </pic:pic>
-              </a:graphicData>
-            </a:graphic>
-          </wp:anchor>
-        </w:drawing>
-      </w:r>
-    </w:p>
-    <w:p>
-      <w:pPr>
-        <w:jc w:val="both"/>
-      </w:pPr>
-    </w:p>
-    <w:p>
-      <w:pPr>
-        <w:jc w:val="both"/>
-        <w:rPr>
-          <w:rFonts w:hint="eastAsia"/>
-        </w:rPr>
-      </w:pPr>
-    </w:p>
-    <w:p>
-      <w:pPr>
-        <w:jc w:val="both"/>
-        <w:rPr>
-          <w:rFonts w:hint="eastAsia"/>
-        </w:rPr>
-      </w:pPr>
-    </w:p>
-    <w:p>
-      <w:pPr>
-        <w:jc w:val="both"/>
-        <w:rPr>
-          <w:rFonts w:hint="eastAsia"/>
-        </w:rPr>
-      </w:pPr>
-    </w:p>
-    <w:p>
-      <w:pPr>
-        <w:jc w:val="both"/>
-        <w:rPr>
-          <w:rFonts w:hint="eastAsia"/>
-        </w:rPr>
-      </w:pPr>
-    </w:p>
-    <w:p>
-      <w:pPr>
-        <w:ind w:left="0" w:leftChars="0" w:firstLine="0" w:firstLineChars="0"/>
-        <w:jc w:val="both"/>
-        <w:rPr>
-          <w:rFonts w:hint="eastAsia"/>
-        </w:rPr>
-      </w:pPr>
-    </w:p>
-    <w:p>
-      <w:pPr>
-        <w:ind w:left="0" w:leftChars="0" w:firstLine="0" w:firstLineChars="0"/>
-        <w:jc w:val="both"/>
-        <w:rPr>
-          <w:rFonts w:hint="eastAsia"/>
-        </w:rPr>
-      </w:pPr>
-    </w:p>
-    <w:p>
-      <w:pPr>
-        <w:ind w:left="0" w:leftChars="0" w:firstLine="0" w:firstLineChars="0"/>
-        <w:jc w:val="both"/>
-        <w:rPr>
-          <w:rFonts w:hint="eastAsia"/>
-        </w:rPr>
-      </w:pPr>
-    </w:p>
-    <w:p>
-      <w:pPr>
-        <w:ind w:left="0" w:leftChars="0" w:firstLine="0" w:firstLineChars="0"/>
-        <w:jc w:val="both"/>
-        <w:rPr>
-          <w:rFonts w:hint="eastAsia"/>
-        </w:rPr>
-      </w:pPr>
-    </w:p>
-    <w:p>
-      <w:pPr>
-        <w:ind w:left="0" w:leftChars="0" w:firstLine="0" w:firstLineChars="0"/>
-        <w:jc w:val="both"/>
-        <w:rPr>
-          <w:rFonts w:hint="eastAsia"/>
-        </w:rPr>
-      </w:pPr>
-    </w:p>
-    <w:p>
-      <w:pPr>
-        <w:ind w:left="0" w:leftChars="0" w:firstLine="0" w:firstLineChars="0"/>
-        <w:jc w:val="both"/>
-        <w:rPr>
-          <w:rFonts w:hint="eastAsia"/>
-        </w:rPr>
-      </w:pPr>
-    </w:p>
-    <w:p>
-      <w:pPr>
-        <w:ind w:left="0" w:leftChars="0" w:firstLine="0" w:firstLineChars="0"/>
-        <w:jc w:val="both"/>
-      </w:pPr>
-      <w:r>
-        <w:rPr>
-          <w:rFonts w:hint="eastAsia"/>
-          <w:noProof/>
-        </w:rPr>
-        <w:t>三等奖　保持向上自带微光</w:t>
-      </w:r>
-    </w:p>
-    <w:p>
-      <w:pPr>
-        <w:jc w:val="both"/>
-      </w:pPr>
-      <w:r>
-        <w:drawing>
-          <wp:anchor distT="0" distB="0" distL="0" distR="0" simplePos="0" relativeHeight="251663360" behindDoc="1" locked="0" layoutInCell="1" allowOverlap="1">
-            <wp:simplePos x="0" y="0"/>
-            <wp:positionH relativeFrom="column">
-              <wp:posOffset>178435</wp:posOffset>
-            </wp:positionH>
-            <wp:positionV relativeFrom="paragraph">
-              <wp:posOffset>204470</wp:posOffset>
-            </wp:positionV>
-            <wp:extent cx="4819650" cy="3619500"/>
-            <wp:effectExtent l="0" t="0" r="0" b="0"/>
-            <wp:wrapTight wrapText="bothSides">
-              <wp:wrapPolygon>
-                <wp:start x="0" y="0"/>
-                <wp:lineTo x="0" y="21555"/>
-                <wp:lineTo x="21515" y="21555"/>
-                <wp:lineTo x="21515" y="0"/>
-                <wp:lineTo x="0" y="0"/>
-              </wp:wrapPolygon>
-            </wp:wrapTight>
-            <wp:docPr id="17" name="picture"/>
-            <wp:cNvGraphicFramePr/>
-            <a:graphic xmlns:a="http://schemas.openxmlformats.org/drawingml/2006/main">
-              <a:graphicData uri="http://schemas.openxmlformats.org/drawingml/2006/picture">
-                <pic:pic xmlns:pic="http://schemas.openxmlformats.org/drawingml/2006/picture">
-                  <pic:nvPicPr>
-                    <pic:cNvPr id="17" name="picture"/>
-                    <pic:cNvPicPr/>
-                  </pic:nvPicPr>
-                  <pic:blipFill>
-                    <a:blip r:embed="rId11"/>
-                    <a:stretch>
-                      <a:fillRect/>
-                    </a:stretch>
-                  </pic:blipFill>
-                  <pic:spPr>
-                    <a:xfrm>
-                      <a:off x="0" y="0"/>
-                      <a:ext cx="4819650" cy="3619500"/>
-                    </a:xfrm>
-                    <a:prstGeom prst="rect">
-                      <a:avLst/>
-                    </a:prstGeom>
-                  </pic:spPr>
-                </pic:pic>
-              </a:graphicData>
-            </a:graphic>
-          </wp:anchor>
-        </w:drawing>
-      </w:r>
-    </w:p>
-    <w:p>
-      <w:pPr>
-        <w:jc w:val="both"/>
-        <w:rPr>
-          <w:rFonts w:hint="eastAsia"/>
-        </w:rPr>
-      </w:pPr>
-      <w:r>
-        <w:t>三等奖　交投智筑园境共生</w:t>
       </w:r>
     </w:p>
     <w:p>
@@ -3538,7 +3181,6 @@
       <w:r>
         <w:rPr>
           <w:rFonts w:hint="eastAsia"/>
-          <w:noProof/>
           <w:lang w:eastAsia="zh-CN"/>
         </w:rPr>
         <w:t>B座活动防雨走廊</w:t>
@@ -3559,7 +3201,6 @@
       <w:r>
         <w:rPr>
           <w:rFonts w:hint="eastAsia"/>
-          <w:noProof/>
           <w:lang w:val="en-US" w:eastAsia="zh-CN"/>
         </w:rPr>
         <w:t>场景落地：易达普产品展示</w:t>
@@ -3583,7 +3224,7 @@
           <w:lang w:val="en-US" w:eastAsia="zh-CN"/>
         </w:rPr>
         <w:drawing>
-          <wp:anchor distT="0" distB="0" distL="114300" distR="114300" simplePos="0" relativeHeight="251666432" behindDoc="1" locked="0" layoutInCell="1" allowOverlap="1">
+          <wp:anchor distT="0" distB="0" distL="114300" distR="114300" simplePos="0" relativeHeight="251661312" behindDoc="1" locked="0" layoutInCell="1" allowOverlap="1">
             <wp:simplePos x="0" y="0"/>
             <wp:positionH relativeFrom="column">
               <wp:posOffset>379095</wp:posOffset>
@@ -3616,7 +3257,7 @@
                     </pic:cNvPicPr>
                   </pic:nvPicPr>
                   <pic:blipFill>
-                    <a:blip r:embed="rId14"/>
+                    <a:blip r:embed="rId9"/>
                     <a:stretch>
                       <a:fillRect/>
                     </a:stretch>
@@ -3772,7 +3413,7 @@
     <w:lsdException w:qFormat="1" w:unhideWhenUsed="0" w:uiPriority="10" w:semiHidden="0" w:name="Title"/>
     <w:lsdException w:uiPriority="99" w:name="Closing"/>
     <w:lsdException w:uiPriority="99" w:name="Signature"/>
-    <w:lsdException w:uiPriority="1" w:name="Default Paragraph Font"/>
+    <w:lsdException w:qFormat="1" w:uiPriority="1" w:name="Default Paragraph Font"/>
     <w:lsdException w:uiPriority="99" w:name="Body Text"/>
     <w:lsdException w:uiPriority="99" w:name="Body Text Indent"/>
     <w:lsdException w:uiPriority="99" w:name="List Continue"/>
@@ -4163,6 +3804,7 @@
     <w:name w:val="Default Paragraph Font"/>
     <w:semiHidden/>
     <w:unhideWhenUsed/>
+    <w:qFormat/>
     <w:uiPriority w:val="1"/>
   </w:style>
   <w:style w:type="table" w:default="1" w:styleId="28">
@@ -5150,6 +4792,7 @@
     <w:name w:val="Intense Quote Char"/>
     <w:basedOn w:val="30"/>
     <w:link w:val="46"/>
+    <w:qFormat/>
     <w:uiPriority w:val="30"/>
     <w:rPr>
       <w:i/>

</xml_diff>

<commit_message>
vault backup: 2026-09-20 08:42:20
</commit_message>
<xml_diff>
--- a/工作/圈式链式/20260918/关于“链上红盟·三联共促”党建联建近期工作推进情况的汇报（提纲）修改版-集团1-优化版.docx
+++ b/工作/圈式链式/20260918/关于“链上红盟·三联共促”党建联建近期工作推进情况的汇报（提纲）修改版-集团1-优化版.docx
@@ -57,8 +57,6 @@
           <w:rFonts w:hint="eastAsia"/>
         </w:rPr>
       </w:pPr>
-      <w:bookmarkStart w:id="0" w:name="_GoBack"/>
-      <w:bookmarkEnd w:id="0"/>
     </w:p>
     <w:p>
       <w:pPr>
@@ -180,37 +178,131 @@
       <w:pPr>
         <w:keepNext w:val="0"/>
         <w:keepLines w:val="0"/>
-        <w:pageBreakBefore w:val="0"/>
         <w:widowControl/>
-        <w:kinsoku/>
-        <w:wordWrap/>
-        <w:overflowPunct/>
-        <w:topLinePunct w:val="0"/>
-        <w:autoSpaceDE/>
-        <w:autoSpaceDN/>
-        <w:bidi w:val="0"/>
-        <w:adjustRightInd/>
-        <w:snapToGrid/>
-        <w:ind w:firstLine="643" w:firstLineChars="200"/>
-        <w:jc w:val="both"/>
-        <w:textAlignment w:val="auto"/>
+        <w:suppressLineNumbers w:val="0"/>
+        <w:jc w:val="left"/>
         <w:rPr>
           <w:rFonts w:hint="eastAsia"/>
         </w:rPr>
       </w:pPr>
       <w:r>
         <w:rPr>
-          <w:rFonts w:hint="eastAsia"/>
+          <w:rFonts w:hint="default" w:ascii="仿宋_GB2312" w:hAnsi="宋体" w:eastAsia="仿宋_GB2312" w:cs="仿宋_GB2312"/>
           <w:b/>
           <w:bCs/>
+          <w:color w:val="000000"/>
+          <w:kern w:val="0"/>
+          <w:sz w:val="31"/>
+          <w:szCs w:val="31"/>
+          <w:lang w:val="en-US" w:eastAsia="zh-CN" w:bidi="ar"/>
         </w:rPr>
-        <w:t>1.强链筑基，惠企服务与园区保障同步提升。</w:t>
+        <w:t>1.聚力“服务”</w:t>
       </w:r>
       <w:r>
         <w:rPr>
           <w:rFonts w:hint="eastAsia"/>
         </w:rPr>
-        <w:t>深化“1日响应、3日解难”惠企服务机制，推动企业诉求全响应、问题处置全闭环，以实现入驻企业服务覆盖率100%为目标，持续擦亮园区服务品牌。9月，按照上级党组织编制的《资源清单》《需求清单》填报模板，组织党员骨干全面摸排园区重点企业底数与产业链配套需求。目前园区共有入驻企业71家，其中国家级高新技术企业11家、专精特新企业2家、科技型中小企业7家，产业基础扎实、创新动能充足。同步全面梳理园区楼宇大厅、屋顶花园、道路、停车场等实景资源，形成总面积超2万㎡的园区实景资源清单，为场景开放和产业赋能打下坚实基础。针对B座客户雨天通行不便问题，专门设置活动防雨走廊，以“小切口”服务推动企业获得感、满意度双提升，用细节传递园区温度。</w:t>
+        <w:t>目前园区共有入驻企业71家，其中国家级高新技术企业11家、专精特新企业</w:t>
+      </w:r>
+      <w:r>
+        <w:rPr>
+          <w:rFonts w:hint="eastAsia"/>
+          <w:lang w:val="en-US" w:eastAsia="zh-CN"/>
+        </w:rPr>
+        <w:t>3</w:t>
+      </w:r>
+      <w:r>
+        <w:rPr>
+          <w:rFonts w:hint="eastAsia"/>
+        </w:rPr>
+        <w:t>家、科技型中小企业</w:t>
+      </w:r>
+      <w:r>
+        <w:rPr>
+          <w:rFonts w:hint="eastAsia"/>
+          <w:lang w:val="en-US" w:eastAsia="zh-CN"/>
+        </w:rPr>
+        <w:t>10</w:t>
+      </w:r>
+      <w:r>
+        <w:rPr>
+          <w:rFonts w:hint="eastAsia"/>
+        </w:rPr>
+        <w:t>家，产业基础扎实、创新动能充足。</w:t>
+      </w:r>
+      <w:r>
+        <w:rPr>
+          <w:rFonts w:hint="eastAsia"/>
+          <w:lang w:val="en-US" w:eastAsia="zh-CN"/>
+        </w:rPr>
+        <w:t>支部根据</w:t>
+      </w:r>
+      <w:r>
+        <w:rPr>
+          <w:rFonts w:hint="eastAsia"/>
+        </w:rPr>
+        <w:t>上级党组织编制的《资源清单》《需求清单》填报模板，组织党员骨干全面摸排园区重点企业底数与产业链配套需求</w:t>
+      </w:r>
+      <w:r>
+        <w:rPr>
+          <w:rFonts w:hint="eastAsia"/>
+          <w:lang w:eastAsia="zh-CN"/>
+        </w:rPr>
+        <w:t>，</w:t>
+      </w:r>
+      <w:r>
+        <w:rPr>
+          <w:rFonts w:hint="eastAsia"/>
+          <w:lang w:val="en-US" w:eastAsia="zh-CN"/>
+        </w:rPr>
+        <w:t>目前已经整理</w:t>
+      </w:r>
+      <w:r>
+        <w:rPr>
+          <w:rFonts w:hint="eastAsia"/>
+        </w:rPr>
+        <w:t>资源</w:t>
+      </w:r>
+      <w:r>
+        <w:rPr>
+          <w:rFonts w:hint="eastAsia"/>
+          <w:lang w:val="en-US" w:eastAsia="zh-CN"/>
+        </w:rPr>
+        <w:t>**条，采集企业</w:t>
+      </w:r>
+      <w:r>
+        <w:rPr>
+          <w:rFonts w:hint="eastAsia"/>
+        </w:rPr>
+        <w:t>需求</w:t>
+      </w:r>
+      <w:r>
+        <w:rPr>
+          <w:rFonts w:hint="eastAsia"/>
+          <w:lang w:val="en-US" w:eastAsia="zh-CN"/>
+        </w:rPr>
+        <w:t>3条，支部将持续完善二张清单内容</w:t>
+      </w:r>
+      <w:bookmarkStart w:id="0" w:name="_GoBack"/>
+      <w:bookmarkEnd w:id="0"/>
+      <w:r>
+        <w:rPr>
+          <w:rFonts w:hint="eastAsia"/>
+        </w:rPr>
+        <w:t>。同步全面梳理园区楼宇大厅、屋顶花园、道路、停车场等实景资源，形成总面积超2万㎡的园区实景资源清单，为场景开放和产业赋能打下坚实基础</w:t>
+      </w:r>
+      <w:r>
+        <w:rPr>
+          <w:rFonts w:hint="eastAsia"/>
+          <w:lang w:eastAsia="zh-CN"/>
+        </w:rPr>
+        <w:t>，</w:t>
+      </w:r>
+      <w:r>
+        <w:rPr>
+          <w:rFonts w:hint="eastAsia"/>
+        </w:rPr>
+        <w:t>目前负一楼停车场已与园内企业易达普合作建成其公司产品的展示区域，率先探索“园区即展厅、场景即试验”的转化路径，为园内企业提供产品展示、场景验证等试验支撑，推动园区实景资源加快向产业发展场景转化。针对B座客户雨天通行不便问题，专门设置活动防雨走廊，以“小切口”服务推动企业获得感、满意度双提升，用细节传递园区温度。</w:t>
       </w:r>
     </w:p>
     <w:p>
@@ -284,7 +376,7 @@
         <w:rPr>
           <w:rFonts w:hint="eastAsia"/>
         </w:rPr>
-        <w:t>结合园区智慧化提升专项方案，加快落地园区一卡通、AI哨兵等智慧化应用项目，推动便捷生活、信息安防等场景数字化升级，以科技手段提升园区运营效率和企业服务体验。统筹推进综合试验环境开放筹备，目前负一楼停车场已与园内企业易达普合作建成其公司产品的展示区域，率先探索“园区即展厅、场景即试验”的转化路径，为园内企业提供产品展示、场景验证等试验支撑，推动园区实景资源加快向产业发展场景转化。</w:t>
+        <w:t>结合园区智慧化提升专项方案，加快落地园区一卡通、AI哨兵等智慧化应用项目，推动便捷生活、信息安防等场景数字化升级，以科技手段提升园区运营效率和企业服务体验。统筹推进综合试验环境开放筹备，</w:t>
       </w:r>
     </w:p>
     <w:p>
@@ -743,7 +835,6 @@
             <w:insideH w:val="none" w:color="auto" w:sz="0" w:space="0"/>
             <w:insideV w:val="none" w:color="auto" w:sz="0" w:space="0"/>
           </w:tblBorders>
-          <w:shd w:val="clear" w:color="auto" w:fill="auto"/>
           <w:tblCellMar>
             <w:top w:w="0" w:type="dxa"/>
             <w:left w:w="108" w:type="dxa"/>
@@ -1160,7 +1251,6 @@
             <w:insideH w:val="none" w:color="auto" w:sz="0" w:space="0"/>
             <w:insideV w:val="none" w:color="auto" w:sz="0" w:space="0"/>
           </w:tblBorders>
-          <w:shd w:val="clear" w:color="auto" w:fill="auto"/>
           <w:tblCellMar>
             <w:top w:w="0" w:type="dxa"/>
             <w:left w:w="108" w:type="dxa"/>
@@ -1326,6 +1416,7 @@
             <w:insideH w:val="none" w:color="auto" w:sz="0" w:space="0"/>
             <w:insideV w:val="none" w:color="auto" w:sz="0" w:space="0"/>
           </w:tblBorders>
+          <w:shd w:val="clear" w:color="auto" w:fill="auto"/>
           <w:tblCellMar>
             <w:top w:w="0" w:type="dxa"/>
             <w:left w:w="108" w:type="dxa"/>
@@ -1491,7 +1582,6 @@
             <w:insideH w:val="none" w:color="auto" w:sz="0" w:space="0"/>
             <w:insideV w:val="none" w:color="auto" w:sz="0" w:space="0"/>
           </w:tblBorders>
-          <w:shd w:val="clear" w:color="auto" w:fill="auto"/>
           <w:tblCellMar>
             <w:top w:w="0" w:type="dxa"/>
             <w:left w:w="108" w:type="dxa"/>
@@ -1657,6 +1747,7 @@
             <w:insideH w:val="none" w:color="auto" w:sz="0" w:space="0"/>
             <w:insideV w:val="none" w:color="auto" w:sz="0" w:space="0"/>
           </w:tblBorders>
+          <w:shd w:val="clear" w:color="auto" w:fill="auto"/>
           <w:tblCellMar>
             <w:top w:w="0" w:type="dxa"/>
             <w:left w:w="108" w:type="dxa"/>
@@ -1988,7 +2079,6 @@
             <w:insideH w:val="none" w:color="auto" w:sz="0" w:space="0"/>
             <w:insideV w:val="none" w:color="auto" w:sz="0" w:space="0"/>
           </w:tblBorders>
-          <w:shd w:val="clear" w:color="auto" w:fill="auto"/>
           <w:tblCellMar>
             <w:top w:w="0" w:type="dxa"/>
             <w:left w:w="108" w:type="dxa"/>
@@ -2154,6 +2244,7 @@
             <w:insideH w:val="none" w:color="auto" w:sz="0" w:space="0"/>
             <w:insideV w:val="none" w:color="auto" w:sz="0" w:space="0"/>
           </w:tblBorders>
+          <w:shd w:val="clear" w:color="auto" w:fill="auto"/>
           <w:tblCellMar>
             <w:top w:w="0" w:type="dxa"/>
             <w:left w:w="108" w:type="dxa"/>
@@ -2485,7 +2576,6 @@
             <w:insideH w:val="none" w:color="auto" w:sz="0" w:space="0"/>
             <w:insideV w:val="none" w:color="auto" w:sz="0" w:space="0"/>
           </w:tblBorders>
-          <w:shd w:val="clear" w:color="auto" w:fill="auto"/>
           <w:tblCellMar>
             <w:top w:w="0" w:type="dxa"/>
             <w:left w:w="108" w:type="dxa"/>
@@ -2651,6 +2741,7 @@
             <w:insideH w:val="none" w:color="auto" w:sz="0" w:space="0"/>
             <w:insideV w:val="none" w:color="auto" w:sz="0" w:space="0"/>
           </w:tblBorders>
+          <w:shd w:val="clear" w:color="auto" w:fill="auto"/>
           <w:tblCellMar>
             <w:top w:w="0" w:type="dxa"/>
             <w:left w:w="108" w:type="dxa"/>

</xml_diff>

<commit_message>
vault backup: 2026-09-20 09:33:45
</commit_message>
<xml_diff>
--- a/工作/圈式链式/20260918/关于“链上红盟·三联共促”党建联建近期工作推进情况的汇报（提纲）修改版-集团1-优化版.docx
+++ b/工作/圈式链式/20260918/关于“链上红盟·三联共促”党建联建近期工作推进情况的汇报（提纲）修改版-集团1-优化版.docx
@@ -228,7 +228,7 @@
         <w:rPr>
           <w:rFonts w:hint="eastAsia"/>
         </w:rPr>
-        <w:t>家，产业基础扎实、创新动能充足。</w:t>
+        <w:t>家，</w:t>
       </w:r>
       <w:r>
         <w:rPr>
@@ -281,15 +281,13 @@
           <w:rFonts w:hint="eastAsia"/>
           <w:lang w:val="en-US" w:eastAsia="zh-CN"/>
         </w:rPr>
-        <w:t>3条，支部将持续完善二张清单内容</w:t>
+        <w:t>3条，同时将持续完善二张清单内容</w:t>
       </w:r>
-      <w:bookmarkStart w:id="0" w:name="_GoBack"/>
-      <w:bookmarkEnd w:id="0"/>
       <w:r>
         <w:rPr>
           <w:rFonts w:hint="eastAsia"/>
         </w:rPr>
-        <w:t>。同步全面梳理园区楼宇大厅、屋顶花园、道路、停车场等实景资源，形成总面积超2万㎡的园区实景资源清单，为场景开放和产业赋能打下坚实基础</w:t>
+        <w:t>。同步全面梳理园区楼宇大厅、屋顶花园、道路、停车场等实景资源，形成总面积超2万㎡的园区实景资源清单</w:t>
       </w:r>
       <w:r>
         <w:rPr>
@@ -302,7 +300,15 @@
         <w:rPr>
           <w:rFonts w:hint="eastAsia"/>
         </w:rPr>
-        <w:t>目前负一楼停车场已与园内企业易达普合作建成其公司产品的展示区域，率先探索“园区即展厅、场景即试验”的转化路径，为园内企业提供产品展示、场景验证等试验支撑，推动园区实景资源加快向产业发展场景转化。针对B座客户雨天通行不便问题，专门设置活动防雨走廊，以“小切口”服务推动企业获得感、满意度双提升，用细节传递园区温度。</w:t>
+        <w:t>目前负一楼停车场已与园内企业易达普合作建成其公司产品的展示区域，率先探索“园区即展厅、场景即试验”的转化路径，为园内企业提供产品展示、场景验证等试验支撑，推动园区实景资源加快向产业发展场景转化。针对B座客户雨天</w:t>
+      </w:r>
+      <w:bookmarkStart w:id="0" w:name="_GoBack"/>
+      <w:bookmarkEnd w:id="0"/>
+      <w:r>
+        <w:rPr>
+          <w:rFonts w:hint="eastAsia"/>
+        </w:rPr>
+        <w:t>通行不便问题，专门设置活动防雨走廊，以“小切口”服务推动企业获得感、满意度双提升，用细节传递园区温度。</w:t>
       </w:r>
     </w:p>
     <w:p>
@@ -908,6 +914,7 @@
             <w:insideH w:val="none" w:color="auto" w:sz="0" w:space="0"/>
             <w:insideV w:val="none" w:color="auto" w:sz="0" w:space="0"/>
           </w:tblBorders>
+          <w:shd w:val="clear" w:color="auto" w:fill="auto"/>
           <w:tblCellMar>
             <w:top w:w="0" w:type="dxa"/>
             <w:left w:w="108" w:type="dxa"/>
@@ -1416,7 +1423,6 @@
             <w:insideH w:val="none" w:color="auto" w:sz="0" w:space="0"/>
             <w:insideV w:val="none" w:color="auto" w:sz="0" w:space="0"/>
           </w:tblBorders>
-          <w:shd w:val="clear" w:color="auto" w:fill="auto"/>
           <w:tblCellMar>
             <w:top w:w="0" w:type="dxa"/>
             <w:left w:w="108" w:type="dxa"/>
@@ -1747,7 +1753,6 @@
             <w:insideH w:val="none" w:color="auto" w:sz="0" w:space="0"/>
             <w:insideV w:val="none" w:color="auto" w:sz="0" w:space="0"/>
           </w:tblBorders>
-          <w:shd w:val="clear" w:color="auto" w:fill="auto"/>
           <w:tblCellMar>
             <w:top w:w="0" w:type="dxa"/>
             <w:left w:w="108" w:type="dxa"/>
@@ -1913,7 +1918,6 @@
             <w:insideH w:val="none" w:color="auto" w:sz="0" w:space="0"/>
             <w:insideV w:val="none" w:color="auto" w:sz="0" w:space="0"/>
           </w:tblBorders>
-          <w:shd w:val="clear" w:color="auto" w:fill="auto"/>
           <w:tblCellMar>
             <w:top w:w="0" w:type="dxa"/>
             <w:left w:w="108" w:type="dxa"/>
@@ -2244,7 +2248,6 @@
             <w:insideH w:val="none" w:color="auto" w:sz="0" w:space="0"/>
             <w:insideV w:val="none" w:color="auto" w:sz="0" w:space="0"/>
           </w:tblBorders>
-          <w:shd w:val="clear" w:color="auto" w:fill="auto"/>
           <w:tblCellMar>
             <w:top w:w="0" w:type="dxa"/>
             <w:left w:w="108" w:type="dxa"/>
@@ -2410,7 +2413,6 @@
             <w:insideH w:val="none" w:color="auto" w:sz="0" w:space="0"/>
             <w:insideV w:val="none" w:color="auto" w:sz="0" w:space="0"/>
           </w:tblBorders>
-          <w:shd w:val="clear" w:color="auto" w:fill="auto"/>
           <w:tblCellMar>
             <w:top w:w="0" w:type="dxa"/>
             <w:left w:w="108" w:type="dxa"/>
@@ -2576,6 +2578,7 @@
             <w:insideH w:val="none" w:color="auto" w:sz="0" w:space="0"/>
             <w:insideV w:val="none" w:color="auto" w:sz="0" w:space="0"/>
           </w:tblBorders>
+          <w:shd w:val="clear" w:color="auto" w:fill="auto"/>
           <w:tblCellMar>
             <w:top w:w="0" w:type="dxa"/>
             <w:left w:w="108" w:type="dxa"/>
@@ -2741,7 +2744,6 @@
             <w:insideH w:val="none" w:color="auto" w:sz="0" w:space="0"/>
             <w:insideV w:val="none" w:color="auto" w:sz="0" w:space="0"/>
           </w:tblBorders>
-          <w:shd w:val="clear" w:color="auto" w:fill="auto"/>
           <w:tblCellMar>
             <w:top w:w="0" w:type="dxa"/>
             <w:left w:w="108" w:type="dxa"/>

</xml_diff>

<commit_message>
vault backup: 2026-09-20 09:40:43
</commit_message>
<xml_diff>
--- a/工作/圈式链式/20260918/关于“链上红盟·三联共促”党建联建近期工作推进情况的汇报（提纲）修改版-集团1-优化版.docx
+++ b/工作/圈式链式/20260918/关于“链上红盟·三联共促”党建联建近期工作推进情况的汇报（提纲）修改版-集团1-优化版.docx
@@ -183,6 +183,7 @@
         <w:jc w:val="left"/>
         <w:rPr>
           <w:rFonts w:hint="eastAsia"/>
+          <w:lang w:val="en-US" w:eastAsia="zh-CN"/>
         </w:rPr>
       </w:pPr>
       <w:r>
@@ -197,6 +198,19 @@
           <w:lang w:val="en-US" w:eastAsia="zh-CN" w:bidi="ar"/>
         </w:rPr>
         <w:t>1.聚力“服务”</w:t>
+      </w:r>
+      <w:r>
+        <w:rPr>
+          <w:rFonts w:hint="eastAsia" w:hAnsi="宋体" w:cs="仿宋_GB2312"/>
+          <w:b/>
+          <w:bCs/>
+          <w:color w:val="000000"/>
+          <w:kern w:val="0"/>
+          <w:sz w:val="31"/>
+          <w:szCs w:val="31"/>
+          <w:lang w:val="en-US" w:eastAsia="zh-CN" w:bidi="ar"/>
+        </w:rPr>
+        <w:t>。</w:t>
       </w:r>
       <w:r>
         <w:rPr>
@@ -281,13 +295,13 @@
           <w:rFonts w:hint="eastAsia"/>
           <w:lang w:val="en-US" w:eastAsia="zh-CN"/>
         </w:rPr>
-        <w:t>3条，同时将持续完善二张清单内容</w:t>
+        <w:t>3条，同时将持续完善二张清单内容；</w:t>
       </w:r>
       <w:r>
         <w:rPr>
           <w:rFonts w:hint="eastAsia"/>
         </w:rPr>
-        <w:t>。同步全面梳理园区楼宇大厅、屋顶花园、道路、停车场等实景资源，形成总面积超2万㎡的园区实景资源清单</w:t>
+        <w:t>同步全面梳理园区楼宇大厅、屋顶花园、道路、停车场等实景资源，形成总面积超2万㎡的园区实景资源清单</w:t>
       </w:r>
       <w:r>
         <w:rPr>
@@ -300,7 +314,14 @@
         <w:rPr>
           <w:rFonts w:hint="eastAsia"/>
         </w:rPr>
-        <w:t>目前负一楼停车场已与园内企业易达普合作建成其公司产品的展示区域，率先探索“园区即展厅、场景即试验”的转化路径，为园内企业提供产品展示、场景验证等试验支撑，推动园区实景资源加快向产业发展场景转化。针对B座客户雨天</w:t>
+        <w:t>目前负一楼停车场已与园内企业易达普合作建成其公司产品的展示区域，率先探索“园区即展厅、场景即试验”的转化路径，为园内企业提供产品展示、场景验证等试验支撑，推动园区实景资源加快向产业发展场景转化</w:t>
+      </w:r>
+      <w:r>
+        <w:rPr>
+          <w:rFonts w:hint="eastAsia"/>
+          <w:lang w:val="en-US" w:eastAsia="zh-CN"/>
+        </w:rPr>
+        <w:t>；</w:t>
       </w:r>
       <w:bookmarkStart w:id="0" w:name="_GoBack"/>
       <w:bookmarkEnd w:id="0"/>
@@ -308,27 +329,49 @@
         <w:rPr>
           <w:rFonts w:hint="eastAsia"/>
         </w:rPr>
-        <w:t>通行不便问题，专门设置活动防雨走廊，以“小切口”服务推动企业获得感、满意度双提升，用细节传递园区温度。</w:t>
+        <w:t>智慧化提升</w:t>
+      </w:r>
+      <w:r>
+        <w:rPr>
+          <w:rFonts w:hint="eastAsia"/>
+          <w:lang w:val="en-US" w:eastAsia="zh-CN"/>
+        </w:rPr>
+        <w:t>方面扎实推动</w:t>
+      </w:r>
+      <w:r>
+        <w:rPr>
+          <w:rFonts w:hint="eastAsia"/>
+        </w:rPr>
+        <w:t>园区一卡通、AI哨兵等智慧化应用项目，推动便捷生活、信息安防等场景数字化升级，以科技手段提升园区运营效率和企业服务体验</w:t>
+      </w:r>
+      <w:r>
+        <w:rPr>
+          <w:rFonts w:hint="eastAsia"/>
+          <w:lang w:val="en-US" w:eastAsia="zh-CN"/>
+        </w:rPr>
+        <w:t>；</w:t>
+      </w:r>
+      <w:r>
+        <w:rPr>
+          <w:rFonts w:hint="eastAsia"/>
+        </w:rPr>
+        <w:t>针对B座客户雨天通行不便问题，专门设置活动防雨走廊，以“小切口”服务推动企业获得感、满意度双提升，用细节传递园区温度</w:t>
+      </w:r>
+      <w:r>
+        <w:rPr>
+          <w:rFonts w:hint="eastAsia"/>
+          <w:lang w:val="en-US" w:eastAsia="zh-CN"/>
+        </w:rPr>
+        <w:t>。</w:t>
       </w:r>
     </w:p>
     <w:p>
       <w:pPr>
         <w:keepNext w:val="0"/>
         <w:keepLines w:val="0"/>
-        <w:pageBreakBefore w:val="0"/>
         <w:widowControl/>
-        <w:kinsoku/>
-        <w:wordWrap/>
-        <w:overflowPunct/>
-        <w:topLinePunct w:val="0"/>
-        <w:autoSpaceDE/>
-        <w:autoSpaceDN/>
-        <w:bidi w:val="0"/>
-        <w:adjustRightInd/>
-        <w:snapToGrid/>
-        <w:ind w:firstLine="643" w:firstLineChars="200"/>
-        <w:jc w:val="both"/>
-        <w:textAlignment w:val="auto"/>
+        <w:suppressLineNumbers w:val="0"/>
+        <w:jc w:val="left"/>
         <w:rPr>
           <w:rFonts w:hint="eastAsia"/>
         </w:rPr>
@@ -339,33 +382,56 @@
           <w:b/>
           <w:bCs/>
         </w:rPr>
-        <w:t>2.补链成群，产业链联合招商取得实质进展。</w:t>
+        <w:t>2.</w:t>
+      </w:r>
+      <w:r>
+        <w:rPr>
+          <w:rFonts w:hint="default" w:ascii="仿宋_GB2312" w:hAnsi="宋体" w:eastAsia="仿宋_GB2312" w:cs="仿宋_GB2312"/>
+          <w:b/>
+          <w:bCs/>
+          <w:color w:val="000000"/>
+          <w:kern w:val="0"/>
+          <w:sz w:val="31"/>
+          <w:szCs w:val="31"/>
+          <w:lang w:val="en-US" w:eastAsia="zh-CN" w:bidi="ar"/>
+        </w:rPr>
+        <w:t>聚力“招引”</w:t>
+      </w:r>
+      <w:r>
+        <w:rPr>
+          <w:rFonts w:hint="eastAsia"/>
+          <w:b/>
+          <w:bCs/>
+        </w:rPr>
+        <w:t>。</w:t>
       </w:r>
       <w:r>
         <w:rPr>
           <w:rFonts w:hint="eastAsia"/>
         </w:rPr>
-        <w:t>推行“链核推荐＋党员跟进”产业链招商模式，围绕园区主导产业全面梳理杭州交投科创中心及回音必大厦轻资产项目靶向招商资源。8-9月，交投科创中心已成功招引入驻企业2家，去化面积1549.75㎡，其中交通信息技术领域企业杭州多翼创新科技有限公司（无人机方向）顺利落地园区A座6楼，产业链集聚效应初步显现，另有多个重点意向企业正在持续跟进洽谈。稳步推进回音必大厦轻资产项目运营，已完成7家企业入驻，去化面积1111㎡。坚持“以商招商、以链引链”，依托链核企业上下游资源精准推介，不断扩大产业集聚效应，为构建协同共生的产业生态蓄势赋能。</w:t>
+        <w:t>推行“链核推荐＋党员跟进”产业链招商模式，围绕园区主导产业全面梳理杭州交投科创中心及回音必大厦轻资产项目靶向招商资源。8-9月，交投科创中心已成功招引入驻企业2家，去化面积1549.75㎡，其中交通信息技术领域企业杭州多翼创新科技有限公司（无人机方向）顺利落地园区A座6楼，另有多个重点意向企业正在持续跟进洽谈</w:t>
+      </w:r>
+      <w:r>
+        <w:rPr>
+          <w:rFonts w:hint="eastAsia"/>
+          <w:lang w:val="en-US" w:eastAsia="zh-CN"/>
+        </w:rPr>
+        <w:t>；</w:t>
+      </w:r>
+      <w:r>
+        <w:rPr>
+          <w:rFonts w:hint="eastAsia"/>
+        </w:rPr>
+        <w:t>稳步推进回音必大厦轻资产项目运营，已完成7家企业入驻，去化面积1111㎡。坚持“以商招商、以链引链”，依托链核企业上下游资源精准推介，不断扩大产业集聚效应，为构建协同共生的产业生态蓄势赋能。</w:t>
       </w:r>
     </w:p>
     <w:p>
       <w:pPr>
         <w:keepNext w:val="0"/>
         <w:keepLines w:val="0"/>
-        <w:pageBreakBefore w:val="0"/>
         <w:widowControl/>
-        <w:kinsoku/>
-        <w:wordWrap/>
-        <w:overflowPunct/>
-        <w:topLinePunct w:val="0"/>
-        <w:autoSpaceDE/>
-        <w:autoSpaceDN/>
-        <w:bidi w:val="0"/>
-        <w:adjustRightInd/>
-        <w:snapToGrid/>
-        <w:ind w:firstLine="643" w:firstLineChars="200"/>
-        <w:jc w:val="both"/>
-        <w:textAlignment w:val="auto"/>
+        <w:suppressLineNumbers w:val="0"/>
+        <w:jc w:val="left"/>
         <w:rPr>
           <w:rFonts w:hint="eastAsia"/>
         </w:rPr>
@@ -376,13 +442,34 @@
           <w:b/>
           <w:bCs/>
         </w:rPr>
-        <w:t>3.场景赋能，园区智慧化应用加快落地。</w:t>
+        <w:t>3.</w:t>
+      </w:r>
+      <w:r>
+        <w:rPr>
+          <w:rFonts w:hint="default" w:ascii="仿宋_GB2312" w:hAnsi="宋体" w:eastAsia="仿宋_GB2312" w:cs="仿宋_GB2312"/>
+          <w:b/>
+          <w:bCs/>
+          <w:color w:val="000000"/>
+          <w:kern w:val="0"/>
+          <w:sz w:val="31"/>
+          <w:szCs w:val="31"/>
+          <w:lang w:val="en-US" w:eastAsia="zh-CN" w:bidi="ar"/>
+        </w:rPr>
+        <w:t>聚力“培育”</w:t>
+      </w:r>
+      <w:r>
+        <w:rPr>
+          <w:rFonts w:hint="eastAsia"/>
+          <w:b/>
+          <w:bCs/>
+        </w:rPr>
+        <w:t>。</w:t>
       </w:r>
       <w:r>
         <w:rPr>
           <w:rFonts w:hint="eastAsia"/>
         </w:rPr>
-        <w:t>结合园区智慧化提升专项方案，加快落地园区一卡通、AI哨兵等智慧化应用项目，推动便捷生活、信息安防等场景数字化升级，以科技手段提升园区运营效率和企业服务体验。统筹推进综合试验环境开放筹备，</w:t>
+        <w:t>统筹推进综合试验环境开放筹备，</w:t>
       </w:r>
     </w:p>
     <w:p>
@@ -1092,7 +1179,6 @@
             <w:insideH w:val="none" w:color="auto" w:sz="0" w:space="0"/>
             <w:insideV w:val="none" w:color="auto" w:sz="0" w:space="0"/>
           </w:tblBorders>
-          <w:shd w:val="clear" w:color="auto" w:fill="auto"/>
           <w:tblCellMar>
             <w:top w:w="0" w:type="dxa"/>
             <w:left w:w="108" w:type="dxa"/>
@@ -1258,6 +1344,7 @@
             <w:insideH w:val="none" w:color="auto" w:sz="0" w:space="0"/>
             <w:insideV w:val="none" w:color="auto" w:sz="0" w:space="0"/>
           </w:tblBorders>
+          <w:shd w:val="clear" w:color="auto" w:fill="auto"/>
           <w:tblCellMar>
             <w:top w:w="0" w:type="dxa"/>
             <w:left w:w="108" w:type="dxa"/>
@@ -1423,6 +1510,7 @@
             <w:insideH w:val="none" w:color="auto" w:sz="0" w:space="0"/>
             <w:insideV w:val="none" w:color="auto" w:sz="0" w:space="0"/>
           </w:tblBorders>
+          <w:shd w:val="clear" w:color="auto" w:fill="auto"/>
           <w:tblCellMar>
             <w:top w:w="0" w:type="dxa"/>
             <w:left w:w="108" w:type="dxa"/>
@@ -1918,6 +2006,7 @@
             <w:insideH w:val="none" w:color="auto" w:sz="0" w:space="0"/>
             <w:insideV w:val="none" w:color="auto" w:sz="0" w:space="0"/>
           </w:tblBorders>
+          <w:shd w:val="clear" w:color="auto" w:fill="auto"/>
           <w:tblCellMar>
             <w:top w:w="0" w:type="dxa"/>
             <w:left w:w="108" w:type="dxa"/>
@@ -2578,7 +2667,6 @@
             <w:insideH w:val="none" w:color="auto" w:sz="0" w:space="0"/>
             <w:insideV w:val="none" w:color="auto" w:sz="0" w:space="0"/>
           </w:tblBorders>
-          <w:shd w:val="clear" w:color="auto" w:fill="auto"/>
           <w:tblCellMar>
             <w:top w:w="0" w:type="dxa"/>
             <w:left w:w="108" w:type="dxa"/>
@@ -2744,6 +2832,7 @@
             <w:insideH w:val="none" w:color="auto" w:sz="0" w:space="0"/>
             <w:insideV w:val="none" w:color="auto" w:sz="0" w:space="0"/>
           </w:tblBorders>
+          <w:shd w:val="clear" w:color="auto" w:fill="auto"/>
           <w:tblCellMar>
             <w:top w:w="0" w:type="dxa"/>
             <w:left w:w="108" w:type="dxa"/>

</xml_diff>

<commit_message>
vault backup: 2026-09-20 09:41:24
</commit_message>
<xml_diff>
--- a/工作/圈式链式/20260918/关于“链上红盟·三联共促”党建联建近期工作推进情况的汇报（提纲）修改版-集团1-优化版.docx
+++ b/工作/圈式链式/20260918/关于“链上红盟·三联共促”党建联建近期工作推进情况的汇报（提纲）修改版-集团1-优化版.docx
@@ -323,8 +323,6 @@
         </w:rPr>
         <w:t>；</w:t>
       </w:r>
-      <w:bookmarkStart w:id="0" w:name="_GoBack"/>
-      <w:bookmarkEnd w:id="0"/>
       <w:r>
         <w:rPr>
           <w:rFonts w:hint="eastAsia"/>
@@ -465,43 +463,8 @@
         </w:rPr>
         <w:t>。</w:t>
       </w:r>
-      <w:r>
-        <w:rPr>
-          <w:rFonts w:hint="eastAsia"/>
-        </w:rPr>
-        <w:t>统筹推进综合试验环境开放筹备，</w:t>
-      </w:r>
-    </w:p>
-    <w:p>
-      <w:pPr>
-        <w:keepNext w:val="0"/>
-        <w:keepLines w:val="0"/>
-        <w:pageBreakBefore w:val="0"/>
-        <w:widowControl/>
-        <w:kinsoku/>
-        <w:wordWrap/>
-        <w:overflowPunct/>
-        <w:topLinePunct w:val="0"/>
-        <w:autoSpaceDE/>
-        <w:autoSpaceDN/>
-        <w:bidi w:val="0"/>
-        <w:adjustRightInd/>
-        <w:snapToGrid/>
-        <w:ind w:firstLine="643" w:firstLineChars="200"/>
-        <w:jc w:val="both"/>
-        <w:textAlignment w:val="auto"/>
-        <w:rPr>
-          <w:rFonts w:hint="eastAsia"/>
-        </w:rPr>
-      </w:pPr>
-      <w:r>
-        <w:rPr>
-          <w:rFonts w:hint="eastAsia"/>
-          <w:b/>
-          <w:bCs/>
-        </w:rPr>
-        <w:t>4.破圈拓界，圈层活动与产业对接有序推进。</w:t>
-      </w:r>
+      <w:bookmarkStart w:id="0" w:name="_GoBack"/>
+      <w:bookmarkEnd w:id="0"/>
       <w:r>
         <w:rPr>
           <w:rFonts w:hint="eastAsia"/>
@@ -1001,7 +964,6 @@
             <w:insideH w:val="none" w:color="auto" w:sz="0" w:space="0"/>
             <w:insideV w:val="none" w:color="auto" w:sz="0" w:space="0"/>
           </w:tblBorders>
-          <w:shd w:val="clear" w:color="auto" w:fill="auto"/>
           <w:tblCellMar>
             <w:top w:w="0" w:type="dxa"/>
             <w:left w:w="108" w:type="dxa"/>
@@ -1344,7 +1306,6 @@
             <w:insideH w:val="none" w:color="auto" w:sz="0" w:space="0"/>
             <w:insideV w:val="none" w:color="auto" w:sz="0" w:space="0"/>
           </w:tblBorders>
-          <w:shd w:val="clear" w:color="auto" w:fill="auto"/>
           <w:tblCellMar>
             <w:top w:w="0" w:type="dxa"/>
             <w:left w:w="108" w:type="dxa"/>
@@ -1510,7 +1471,6 @@
             <w:insideH w:val="none" w:color="auto" w:sz="0" w:space="0"/>
             <w:insideV w:val="none" w:color="auto" w:sz="0" w:space="0"/>
           </w:tblBorders>
-          <w:shd w:val="clear" w:color="auto" w:fill="auto"/>
           <w:tblCellMar>
             <w:top w:w="0" w:type="dxa"/>
             <w:left w:w="108" w:type="dxa"/>
@@ -1676,6 +1636,7 @@
             <w:insideH w:val="none" w:color="auto" w:sz="0" w:space="0"/>
             <w:insideV w:val="none" w:color="auto" w:sz="0" w:space="0"/>
           </w:tblBorders>
+          <w:shd w:val="clear" w:color="auto" w:fill="auto"/>
           <w:tblCellMar>
             <w:top w:w="0" w:type="dxa"/>
             <w:left w:w="108" w:type="dxa"/>
@@ -2832,7 +2793,6 @@
             <w:insideH w:val="none" w:color="auto" w:sz="0" w:space="0"/>
             <w:insideV w:val="none" w:color="auto" w:sz="0" w:space="0"/>
           </w:tblBorders>
-          <w:shd w:val="clear" w:color="auto" w:fill="auto"/>
           <w:tblCellMar>
             <w:top w:w="0" w:type="dxa"/>
             <w:left w:w="108" w:type="dxa"/>

</xml_diff>

<commit_message>
vault backup: 2026-09-20 09:41:53
</commit_message>
<xml_diff>
--- a/工作/圈式链式/20260918/关于“链上红盟·三联共促”党建联建近期工作推进情况的汇报（提纲）修改版-集团1-优化版.docx
+++ b/工作/圈式链式/20260918/关于“链上红盟·三联共促”党建联建近期工作推进情况的汇报（提纲）修改版-集团1-优化版.docx
@@ -113,7 +113,7 @@
         <w:rPr>
           <w:rFonts w:hint="eastAsia" w:ascii="楷体" w:hAnsi="楷体" w:eastAsia="楷体" w:cs="楷体"/>
         </w:rPr>
-        <w:t>一、强化组织领导，压紧压实职责任务</w:t>
+        <w:t>一、强化组织领导</w:t>
       </w:r>
     </w:p>
     <w:p>
@@ -165,14 +165,24 @@
         <w:textAlignment w:val="auto"/>
         <w:rPr>
           <w:rFonts w:hint="eastAsia" w:ascii="楷体" w:hAnsi="楷体" w:eastAsia="楷体" w:cs="楷体"/>
+          <w:lang w:val="en-US" w:eastAsia="zh-CN"/>
         </w:rPr>
       </w:pPr>
       <w:r>
         <w:rPr>
           <w:rFonts w:hint="eastAsia" w:ascii="楷体" w:hAnsi="楷体" w:eastAsia="楷体" w:cs="楷体"/>
         </w:rPr>
-        <w:t>二、聚焦重点任务，联建工作取得阶段性成效</w:t>
+        <w:t>二、重点任务</w:t>
       </w:r>
+      <w:r>
+        <w:rPr>
+          <w:rFonts w:hint="eastAsia" w:ascii="楷体" w:hAnsi="楷体" w:eastAsia="楷体" w:cs="楷体"/>
+          <w:lang w:val="en-US" w:eastAsia="zh-CN"/>
+        </w:rPr>
+        <w:t>情况</w:t>
+      </w:r>
+      <w:bookmarkStart w:id="0" w:name="_GoBack"/>
+      <w:bookmarkEnd w:id="0"/>
     </w:p>
     <w:p>
       <w:pPr>
@@ -463,8 +473,6 @@
         </w:rPr>
         <w:t>。</w:t>
       </w:r>
-      <w:bookmarkStart w:id="0" w:name="_GoBack"/>
-      <w:bookmarkEnd w:id="0"/>
       <w:r>
         <w:rPr>
           <w:rFonts w:hint="eastAsia"/>
@@ -1636,7 +1644,6 @@
             <w:insideH w:val="none" w:color="auto" w:sz="0" w:space="0"/>
             <w:insideV w:val="none" w:color="auto" w:sz="0" w:space="0"/>
           </w:tblBorders>
-          <w:shd w:val="clear" w:color="auto" w:fill="auto"/>
           <w:tblCellMar>
             <w:top w:w="0" w:type="dxa"/>
             <w:left w:w="108" w:type="dxa"/>
@@ -1967,7 +1974,6 @@
             <w:insideH w:val="none" w:color="auto" w:sz="0" w:space="0"/>
             <w:insideV w:val="none" w:color="auto" w:sz="0" w:space="0"/>
           </w:tblBorders>
-          <w:shd w:val="clear" w:color="auto" w:fill="auto"/>
           <w:tblCellMar>
             <w:top w:w="0" w:type="dxa"/>
             <w:left w:w="108" w:type="dxa"/>

</xml_diff>

<commit_message>
vault backup: 2026-09-20 17:58:26
</commit_message>
<xml_diff>
--- a/工作/圈式链式/20260918/关于“链上红盟·三联共促”党建联建近期工作推进情况的汇报（提纲）修改版-集团1-优化版.docx
+++ b/工作/圈式链式/20260918/关于“链上红盟·三联共促”党建联建近期工作推进情况的汇报（提纲）修改版-集团1-优化版.docx
@@ -181,8 +181,6 @@
         </w:rPr>
         <w:t>情况</w:t>
       </w:r>
-      <w:bookmarkStart w:id="0" w:name="_GoBack"/>
-      <w:bookmarkEnd w:id="0"/>
     </w:p>
     <w:p>
       <w:pPr>
@@ -225,12 +223,14 @@
       <w:r>
         <w:rPr>
           <w:rFonts w:hint="eastAsia"/>
+          <w:color w:val="FF0000"/>
         </w:rPr>
         <w:t>目前园区共有入驻企业71家，其中国家级高新技术企业11家、专精特新企业</w:t>
       </w:r>
       <w:r>
         <w:rPr>
           <w:rFonts w:hint="eastAsia"/>
+          <w:color w:val="FF0000"/>
           <w:lang w:val="en-US" w:eastAsia="zh-CN"/>
         </w:rPr>
         <w:t>3</w:t>
@@ -238,21 +238,30 @@
       <w:r>
         <w:rPr>
           <w:rFonts w:hint="eastAsia"/>
+          <w:color w:val="FF0000"/>
         </w:rPr>
         <w:t>家、科技型中小企业</w:t>
       </w:r>
       <w:r>
         <w:rPr>
           <w:rFonts w:hint="eastAsia"/>
+          <w:color w:val="FF0000"/>
           <w:lang w:val="en-US" w:eastAsia="zh-CN"/>
         </w:rPr>
-        <w:t>10</w:t>
+        <w:t>7</w:t>
+      </w:r>
+      <w:r>
+        <w:rPr>
+          <w:rFonts w:hint="eastAsia"/>
+          <w:color w:val="FF0000"/>
+        </w:rPr>
+        <w:t>家</w:t>
       </w:r>
       <w:r>
         <w:rPr>
           <w:rFonts w:hint="eastAsia"/>
         </w:rPr>
-        <w:t>家，</w:t>
+        <w:t>，</w:t>
       </w:r>
       <w:r>
         <w:rPr>
@@ -292,7 +301,7 @@
           <w:rFonts w:hint="eastAsia"/>
           <w:lang w:val="en-US" w:eastAsia="zh-CN"/>
         </w:rPr>
-        <w:t>**条，采集企业</w:t>
+        <w:t>9项28条，采集企业合理</w:t>
       </w:r>
       <w:r>
         <w:rPr>
@@ -305,13 +314,13 @@
           <w:rFonts w:hint="eastAsia"/>
           <w:lang w:val="en-US" w:eastAsia="zh-CN"/>
         </w:rPr>
-        <w:t>3条，同时将持续完善二张清单内容；</w:t>
+        <w:t>3条，也将持续完善二张清单内容；</w:t>
       </w:r>
       <w:r>
         <w:rPr>
           <w:rFonts w:hint="eastAsia"/>
         </w:rPr>
-        <w:t>同步全面梳理园区楼宇大厅、屋顶花园、道路、停车场等实景资源，形成总面积超2万㎡的园区实景资源清单</w:t>
+        <w:t>全面梳理园区楼宇大厅、屋顶花园、道路、停车场等实景资源，形成总面积超2万㎡的园区实景资源清单</w:t>
       </w:r>
       <w:r>
         <w:rPr>
@@ -535,7 +544,22 @@
         <w:rPr>
           <w:rFonts w:hint="eastAsia"/>
         </w:rPr>
-        <w:t>外部协调难度较大。党建联建涉及滨江物联网小镇党委、滨江行政服务中心党总支等多家外部单位，各单位隶属关系不同、工作节奏各异，智慧公司党支部层级统筹推动力度有限，跨单位资源调配与事项协调效率有待提升，需要上级党委在更高层面帮助打通联建工作中的堵点难点。</w:t>
+        <w:t>党建联建涉及滨江物联网小镇党委、滨江行政服务中心党总支等多家外部单位，各单位隶属关系不同、工作节奏各异，智慧公司党支部层级统筹推动力度有限，跨单位资源调配与事项协调需要上级党委在更高层面</w:t>
+      </w:r>
+      <w:r>
+        <w:rPr>
+          <w:rFonts w:hint="eastAsia"/>
+          <w:lang w:val="en-US" w:eastAsia="zh-CN"/>
+        </w:rPr>
+        <w:t>给予支持</w:t>
+      </w:r>
+      <w:bookmarkStart w:id="0" w:name="_GoBack"/>
+      <w:bookmarkEnd w:id="0"/>
+      <w:r>
+        <w:rPr>
+          <w:rFonts w:hint="eastAsia"/>
+        </w:rPr>
+        <w:t>。</w:t>
       </w:r>
     </w:p>
     <w:p>
@@ -899,6 +923,7 @@
             <w:insideH w:val="none" w:color="auto" w:sz="0" w:space="0"/>
             <w:insideV w:val="none" w:color="auto" w:sz="0" w:space="0"/>
           </w:tblBorders>
+          <w:shd w:val="clear" w:color="auto" w:fill="auto"/>
           <w:tblCellMar>
             <w:top w:w="0" w:type="dxa"/>
             <w:left w:w="108" w:type="dxa"/>
@@ -972,6 +997,7 @@
             <w:insideH w:val="none" w:color="auto" w:sz="0" w:space="0"/>
             <w:insideV w:val="none" w:color="auto" w:sz="0" w:space="0"/>
           </w:tblBorders>
+          <w:shd w:val="clear" w:color="auto" w:fill="auto"/>
           <w:tblCellMar>
             <w:top w:w="0" w:type="dxa"/>
             <w:left w:w="108" w:type="dxa"/>
@@ -1314,6 +1340,7 @@
             <w:insideH w:val="none" w:color="auto" w:sz="0" w:space="0"/>
             <w:insideV w:val="none" w:color="auto" w:sz="0" w:space="0"/>
           </w:tblBorders>
+          <w:shd w:val="clear" w:color="auto" w:fill="auto"/>
           <w:tblCellMar>
             <w:top w:w="0" w:type="dxa"/>
             <w:left w:w="108" w:type="dxa"/>
@@ -1479,6 +1506,7 @@
             <w:insideH w:val="none" w:color="auto" w:sz="0" w:space="0"/>
             <w:insideV w:val="none" w:color="auto" w:sz="0" w:space="0"/>
           </w:tblBorders>
+          <w:shd w:val="clear" w:color="auto" w:fill="auto"/>
           <w:tblCellMar>
             <w:top w:w="0" w:type="dxa"/>
             <w:left w:w="108" w:type="dxa"/>
@@ -1809,6 +1837,7 @@
             <w:insideH w:val="none" w:color="auto" w:sz="0" w:space="0"/>
             <w:insideV w:val="none" w:color="auto" w:sz="0" w:space="0"/>
           </w:tblBorders>
+          <w:shd w:val="clear" w:color="auto" w:fill="auto"/>
           <w:tblCellMar>
             <w:top w:w="0" w:type="dxa"/>
             <w:left w:w="108" w:type="dxa"/>
@@ -2139,6 +2168,7 @@
             <w:insideH w:val="none" w:color="auto" w:sz="0" w:space="0"/>
             <w:insideV w:val="none" w:color="auto" w:sz="0" w:space="0"/>
           </w:tblBorders>
+          <w:shd w:val="clear" w:color="auto" w:fill="auto"/>
           <w:tblCellMar>
             <w:top w:w="0" w:type="dxa"/>
             <w:left w:w="108" w:type="dxa"/>
@@ -2304,6 +2334,7 @@
             <w:insideH w:val="none" w:color="auto" w:sz="0" w:space="0"/>
             <w:insideV w:val="none" w:color="auto" w:sz="0" w:space="0"/>
           </w:tblBorders>
+          <w:shd w:val="clear" w:color="auto" w:fill="auto"/>
           <w:tblCellMar>
             <w:top w:w="0" w:type="dxa"/>
             <w:left w:w="108" w:type="dxa"/>
@@ -2634,6 +2665,7 @@
             <w:insideH w:val="none" w:color="auto" w:sz="0" w:space="0"/>
             <w:insideV w:val="none" w:color="auto" w:sz="0" w:space="0"/>
           </w:tblBorders>
+          <w:shd w:val="clear" w:color="auto" w:fill="auto"/>
           <w:tblCellMar>
             <w:top w:w="0" w:type="dxa"/>
             <w:left w:w="108" w:type="dxa"/>
@@ -2799,6 +2831,7 @@
             <w:insideH w:val="none" w:color="auto" w:sz="0" w:space="0"/>
             <w:insideV w:val="none" w:color="auto" w:sz="0" w:space="0"/>
           </w:tblBorders>
+          <w:shd w:val="clear" w:color="auto" w:fill="auto"/>
           <w:tblCellMar>
             <w:top w:w="0" w:type="dxa"/>
             <w:left w:w="108" w:type="dxa"/>

</xml_diff>